<commit_message>
Rivista la relazione e il README
</commit_message>
<xml_diff>
--- a/HackHub.docx
+++ b/HackHub.docx
@@ -4,8 +4,7 @@
   <w:body>
     <w:p>
       <w:pPr>
-        <w:pStyle w:val="Heading1"/>
-        <w:jc w:val="both"/>
+        <w:pStyle w:val="Titolo1"/>
       </w:pPr>
       <w:proofErr w:type="spellStart"/>
       <w:r>
@@ -15,7 +14,7 @@
     </w:p>
     <w:p>
       <w:pPr>
-        <w:pStyle w:val="Heading2"/>
+        <w:pStyle w:val="Titolo2"/>
       </w:pPr>
       <w:r>
         <w:t xml:space="preserve">Panoramica progettuale </w:t>
@@ -23,79 +22,96 @@
     </w:p>
     <w:p>
       <w:pPr>
-        <w:pStyle w:val="Heading3"/>
+        <w:pStyle w:val="Titolo3"/>
       </w:pPr>
       <w:r>
         <w:t>Introduzione</w:t>
       </w:r>
     </w:p>
     <w:p>
-      <w:pPr>
-        <w:jc w:val="both"/>
-      </w:pPr>
       <w:proofErr w:type="spellStart"/>
       <w:r>
         <w:t>Hackhub</w:t>
       </w:r>
       <w:proofErr w:type="spellEnd"/>
       <w:r>
-        <w:t xml:space="preserve"> è una piattaforma web pensata per gestire in modo completo il ciclo di vita degli hackathon, competizioni a tempo in cui singoli o </w:t>
-      </w:r>
-      <w:proofErr w:type="gramStart"/>
-      <w:r>
-        <w:t>team</w:t>
-      </w:r>
-      <w:proofErr w:type="gramEnd"/>
-      <w:r>
-        <w:t xml:space="preserve"> sviluppano e consegnano un progetto per raggiungere un obiettivo comune. L’applicazione consente di digitalizzare tutte le fasi dell’evento, dalla registrazione dei partecipanti fino alla proclamazione del vincitore.</w:t>
-      </w:r>
-    </w:p>
-    <w:p>
-      <w:pPr>
-        <w:jc w:val="both"/>
-      </w:pPr>
-      <w:r>
+        <w:t xml:space="preserve"> è una piattaforma web pensata per gestire in modo completo il ciclo di vita degli hackathon</w:t>
+      </w:r>
+      <w:r>
+        <w:rPr>
+          <w:highlight w:val="black"/>
+        </w:rPr>
+        <w:t>, competizioni a tempo in cui singoli o team sviluppano e consegnano un progetto per raggiungere un obiettivo comune.</w:t>
+      </w:r>
+      <w:r>
+        <w:t xml:space="preserve"> L’applicazione consente di digitalizzare tutte le fasi dell’evento, dalla registrazione dei partecipanti fino alla proclamazione del vincitore.</w:t>
+      </w:r>
+    </w:p>
+    <w:p>
+      <w:r>
+        <w:rPr>
+          <w:highlight w:val="black"/>
+        </w:rPr>
         <w:t xml:space="preserve">Realizzata con </w:t>
       </w:r>
       <w:proofErr w:type="spellStart"/>
       <w:r>
+        <w:rPr>
+          <w:highlight w:val="black"/>
+        </w:rPr>
         <w:t>backend</w:t>
       </w:r>
       <w:proofErr w:type="spellEnd"/>
       <w:r>
+        <w:rPr>
+          <w:highlight w:val="black"/>
+        </w:rPr>
         <w:t xml:space="preserve"> in Java e Spring Boot e </w:t>
       </w:r>
       <w:proofErr w:type="spellStart"/>
       <w:r>
+        <w:rPr>
+          <w:highlight w:val="black"/>
+        </w:rPr>
         <w:t>frontend</w:t>
       </w:r>
       <w:proofErr w:type="spellEnd"/>
       <w:r>
+        <w:rPr>
+          <w:highlight w:val="black"/>
+        </w:rPr>
         <w:t xml:space="preserve"> in </w:t>
       </w:r>
       <w:proofErr w:type="spellStart"/>
       <w:r>
+        <w:rPr>
+          <w:highlight w:val="black"/>
+        </w:rPr>
         <w:t>Angular</w:t>
       </w:r>
       <w:proofErr w:type="spellEnd"/>
       <w:r>
-        <w:t xml:space="preserve">. Il sistema offre un ambiente centralizzato per creare e gestire hackathon, permettendo agli utenti di formare </w:t>
-      </w:r>
-      <w:proofErr w:type="gramStart"/>
-      <w:r>
-        <w:t>team</w:t>
-      </w:r>
-      <w:proofErr w:type="gramEnd"/>
-      <w:r>
-        <w:t>, unirsi a gruppi esistenti e caricare le proprie sottomissioni aggiornabili fino alla scadenza.</w:t>
-      </w:r>
-    </w:p>
-    <w:p>
-      <w:pPr>
-        <w:jc w:val="both"/>
-      </w:pPr>
-      <w:r>
-        <w:t xml:space="preserve">Include inoltre un sistema di valutazione affidato ai giudici, con punteggi e feedback, e consente agli organizzatori di decretare il vincitore, con eventuale integrazione a sistemi di pagamento per i premi. Sono presenti anche funzionalità di supporto tramite </w:t>
+        <w:rPr>
+          <w:highlight w:val="black"/>
+        </w:rPr>
+        <w:t>.</w:t>
+      </w:r>
+      <w:r>
+        <w:t xml:space="preserve"> Il sistema offre un ambiente centralizzato per creare e gestire hackathon, permettendo agli utenti di formare team, unirsi a gruppi esistenti e caricare le proprie sottomissioni aggiornabili fino alla scadenza.</w:t>
+      </w:r>
+    </w:p>
+    <w:p>
+      <w:r>
+        <w:t>Include inoltre un sistema di valutazione affidato ai giudici, con punteggi e feedback, e consente agli organizzatori di decretare il vincitore</w:t>
+      </w:r>
+      <w:r>
+        <w:rPr>
+          <w:highlight w:val="black"/>
+        </w:rPr>
+        <w:t>, con eventuale integrazione a sistemi di pagamento per i premi.</w:t>
+      </w:r>
+      <w:r>
+        <w:t xml:space="preserve"> Sono presenti anche funzionalità di supporto tramite </w:t>
       </w:r>
       <w:proofErr w:type="spellStart"/>
       <w:r>
@@ -103,21 +119,24 @@
       </w:r>
       <w:proofErr w:type="spellEnd"/>
       <w:r>
-        <w:t>, pianificazione di call e segnalazione di violazioni, il tutto protetto da un controllo degli accessi basato sui ruoli degli utenti.</w:t>
-      </w:r>
-    </w:p>
-    <w:p>
-      <w:pPr>
-        <w:pStyle w:val="Heading3"/>
+        <w:t>, pianificazione di call e segnalazione di violazioni</w:t>
+      </w:r>
+      <w:r>
+        <w:rPr>
+          <w:highlight w:val="black"/>
+        </w:rPr>
+        <w:t>, il tutto protetto da un controllo degli accessi basato sui ruoli degli utenti.</w:t>
+      </w:r>
+    </w:p>
+    <w:p>
+      <w:pPr>
+        <w:pStyle w:val="Titolo3"/>
       </w:pPr>
       <w:r>
         <w:t>Ruoli nel progetto</w:t>
       </w:r>
     </w:p>
     <w:p>
-      <w:pPr>
-        <w:jc w:val="both"/>
-      </w:pPr>
       <w:r>
         <w:t xml:space="preserve">Il sistema supporta </w:t>
       </w:r>
@@ -139,41 +158,65 @@
       <w:r>
         <w:t xml:space="preserve"> con responsabilità e livelli di accesso distinti. </w:t>
       </w:r>
-      <w:proofErr w:type="gramStart"/>
-      <w:r>
-        <w:t>In particolare</w:t>
-      </w:r>
-      <w:proofErr w:type="gramEnd"/>
-      <w:r>
-        <w:t xml:space="preserve"> possiamo andare a distinguere due categorie di ruoli, quelli statici cioè assegnati in fase di registrazione, in questa categoria possiamo situare </w:t>
-      </w:r>
-      <w:proofErr w:type="spellStart"/>
-      <w:proofErr w:type="gramStart"/>
-      <w:r>
-        <w:t>l utente</w:t>
-      </w:r>
-      <w:proofErr w:type="spellEnd"/>
-      <w:proofErr w:type="gramEnd"/>
-      <w:r>
-        <w:t xml:space="preserve">(registrato), lo staff e l </w:t>
-      </w:r>
-      <w:proofErr w:type="gramStart"/>
-      <w:r>
-        <w:t>admin(</w:t>
-      </w:r>
-      <w:proofErr w:type="gramEnd"/>
-      <w:r>
-        <w:t>account presente di default nel sistema. Poi abbiamo quelli che sono i ruoli dinamici, cioè il modo in cui un ruolo statico interagisce con hackathon o team di fatto sono i seguenti:</w:t>
-      </w:r>
-    </w:p>
-    <w:p>
-      <w:pPr>
-        <w:pStyle w:val="ListParagraph"/>
+      <w:r>
+        <w:t>In particolare possiamo andare a distinguere due categorie di ruoli, quelli statici cioè assegnati in fase di registrazione, in questa categoria possiamo situare l</w:t>
+      </w:r>
+      <w:r>
+        <w:t>’</w:t>
+      </w:r>
+      <w:r>
+        <w:t>utente</w:t>
+      </w:r>
+      <w:r>
+        <w:t xml:space="preserve"> </w:t>
+      </w:r>
+      <w:r>
+        <w:t>(registrato), lo staff e l</w:t>
+      </w:r>
+      <w:r>
+        <w:t>’</w:t>
+      </w:r>
+      <w:r>
+        <w:t>admin</w:t>
+      </w:r>
+      <w:r>
+        <w:t xml:space="preserve"> </w:t>
+      </w:r>
+      <w:r>
+        <w:t>(account presente di default nel sistema</w:t>
+      </w:r>
+      <w:r>
+        <w:t>)</w:t>
+      </w:r>
+      <w:r>
+        <w:t xml:space="preserve">. Poi abbiamo quelli che sono i ruoli dinamici, cioè il modo in cui un ruolo statico interagisce </w:t>
+      </w:r>
+      <w:r>
+        <w:t>con il sistema</w:t>
+      </w:r>
+      <w:r>
+        <w:rPr>
+          <w:highlight w:val="black"/>
+        </w:rPr>
+        <w:t>.</w:t>
+      </w:r>
+      <w:r>
+        <w:rPr>
+          <w:highlight w:val="black"/>
+        </w:rPr>
+        <w:t xml:space="preserve"> di fatto sono i seguenti</w:t>
+      </w:r>
+      <w:r>
+        <w:t>:</w:t>
+      </w:r>
+    </w:p>
+    <w:p>
+      <w:pPr>
+        <w:pStyle w:val="Paragrafoelenco"/>
         <w:numPr>
           <w:ilvl w:val="0"/>
           <w:numId w:val="4"/>
         </w:numPr>
-        <w:jc w:val="both"/>
       </w:pPr>
       <w:r>
         <w:t>Staff:</w:t>
@@ -181,12 +224,11 @@
     </w:p>
     <w:p>
       <w:pPr>
-        <w:pStyle w:val="ListParagraph"/>
+        <w:pStyle w:val="Paragrafoelenco"/>
         <w:numPr>
           <w:ilvl w:val="1"/>
           <w:numId w:val="4"/>
         </w:numPr>
-        <w:jc w:val="both"/>
       </w:pPr>
       <w:r>
         <w:t>Mentore</w:t>
@@ -194,12 +236,11 @@
     </w:p>
     <w:p>
       <w:pPr>
-        <w:pStyle w:val="ListParagraph"/>
+        <w:pStyle w:val="Paragrafoelenco"/>
         <w:numPr>
           <w:ilvl w:val="1"/>
           <w:numId w:val="4"/>
         </w:numPr>
-        <w:jc w:val="both"/>
       </w:pPr>
       <w:r>
         <w:t>Giudice</w:t>
@@ -207,12 +248,11 @@
     </w:p>
     <w:p>
       <w:pPr>
-        <w:pStyle w:val="ListParagraph"/>
+        <w:pStyle w:val="Paragrafoelenco"/>
         <w:numPr>
           <w:ilvl w:val="1"/>
           <w:numId w:val="4"/>
         </w:numPr>
-        <w:jc w:val="both"/>
       </w:pPr>
       <w:r>
         <w:t>Organizzatore</w:t>
@@ -220,12 +260,11 @@
     </w:p>
     <w:p>
       <w:pPr>
-        <w:pStyle w:val="ListParagraph"/>
+        <w:pStyle w:val="Paragrafoelenco"/>
         <w:numPr>
           <w:ilvl w:val="0"/>
           <w:numId w:val="4"/>
         </w:numPr>
-        <w:jc w:val="both"/>
       </w:pPr>
       <w:r>
         <w:t>Utente:</w:t>
@@ -233,12 +272,11 @@
     </w:p>
     <w:p>
       <w:pPr>
-        <w:pStyle w:val="ListParagraph"/>
+        <w:pStyle w:val="Paragrafoelenco"/>
         <w:numPr>
           <w:ilvl w:val="1"/>
           <w:numId w:val="4"/>
         </w:numPr>
-        <w:jc w:val="both"/>
       </w:pPr>
       <w:r>
         <w:t>Team leader</w:t>
@@ -246,12 +284,11 @@
     </w:p>
     <w:p>
       <w:pPr>
-        <w:pStyle w:val="ListParagraph"/>
+        <w:pStyle w:val="Paragrafoelenco"/>
         <w:numPr>
           <w:ilvl w:val="1"/>
           <w:numId w:val="4"/>
         </w:numPr>
-        <w:jc w:val="both"/>
       </w:pPr>
       <w:r>
         <w:t>Membro del Team</w:t>
@@ -259,236 +296,304 @@
     </w:p>
     <w:p>
       <w:pPr>
-        <w:pStyle w:val="Heading4"/>
+        <w:pStyle w:val="Titolo4"/>
       </w:pPr>
       <w:r>
         <w:t>Visitatore</w:t>
       </w:r>
     </w:p>
     <w:p>
-      <w:pPr>
-        <w:jc w:val="both"/>
-      </w:pPr>
-      <w:r>
-        <w:t xml:space="preserve">Il visitatore è un utente non autenticato che accede liberamente al sito per consultare le informazioni pubbliche sugli hackathon. Può navigare l'elenco degli eventi, visualizzarne i dettagli e leggere le informazioni generali sulla piattaforma. Non può accedere ad alcuna funzionalità operativa finché non effettua la registrazione </w:t>
-      </w:r>
-      <w:r>
+      <w:r>
+        <w:t xml:space="preserve">Il visitatore è un utente non autenticato che accede liberamente al sito per consultare le informazioni pubbliche sugli hackathon. </w:t>
+      </w:r>
+      <w:r>
+        <w:rPr>
+          <w:highlight w:val="black"/>
+        </w:rPr>
+        <w:t xml:space="preserve">Può navigare l'elenco degli eventi, visualizzarne i dettagli e leggere le informazioni generali sulla piattaforma. Non può accedere ad alcuna funzionalità operativa finché non effettua la registrazione </w:t>
+      </w:r>
+      <w:r>
+        <w:rPr>
+          <w:highlight w:val="black"/>
+        </w:rPr>
         <w:t>o l’</w:t>
       </w:r>
       <w:r>
+        <w:rPr>
+          <w:highlight w:val="black"/>
+        </w:rPr>
         <w:t>accesso.</w:t>
       </w:r>
     </w:p>
     <w:p>
       <w:pPr>
-        <w:pStyle w:val="Heading4"/>
+        <w:pStyle w:val="Titolo4"/>
+      </w:pPr>
+      <w:r>
+        <w:t>Utente Registrato</w:t>
+      </w:r>
+    </w:p>
+    <w:p>
+      <w:r>
+        <w:t xml:space="preserve">L'Utente Registrato </w:t>
+      </w:r>
+      <w:r>
+        <w:rPr>
+          <w:highlight w:val="black"/>
+        </w:rPr>
+        <w:t>gestisce la propria partecipazione agli hackathon attraverso i team. Nello specifico,</w:t>
+      </w:r>
+      <w:r>
+        <w:t xml:space="preserve"> ha la possibilità di creare un nuovo gruppo invitando altri utenti presenti sulla piattaforma, oppure può decidere di accettare un invito per unirsi a un team già esistente.</w:t>
+      </w:r>
+    </w:p>
+    <w:p>
+      <w:pPr>
+        <w:pStyle w:val="Titolo5"/>
       </w:pPr>
       <w:r>
         <w:lastRenderedPageBreak/>
-        <w:t>Utente Registrato</w:t>
-      </w:r>
-    </w:p>
-    <w:p>
-      <w:r>
-        <w:t xml:space="preserve">L'Utente Registrato gestisce la propria partecipazione agli hackathon attraverso </w:t>
-      </w:r>
-      <w:proofErr w:type="gramStart"/>
-      <w:r>
-        <w:t>i team</w:t>
-      </w:r>
-      <w:proofErr w:type="gramEnd"/>
-      <w:r>
-        <w:t xml:space="preserve">. Nello specifico, ha la possibilità di creare un nuovo gruppo invitando altri utenti presenti sulla piattaforma, oppure può decidere di accettare un invito per unirsi a </w:t>
-      </w:r>
-      <w:proofErr w:type="gramStart"/>
-      <w:r>
-        <w:t>un team già esistente</w:t>
-      </w:r>
-      <w:proofErr w:type="gramEnd"/>
-      <w:r>
-        <w:t>.</w:t>
-      </w:r>
-    </w:p>
-    <w:p>
-      <w:pPr>
-        <w:pStyle w:val="Heading4"/>
-      </w:pPr>
-      <w:r>
         <w:t xml:space="preserve">Team leader </w:t>
       </w:r>
     </w:p>
     <w:p>
       <w:r>
-        <w:t xml:space="preserve">Il Team Leader è colui che ha creato </w:t>
-      </w:r>
-      <w:proofErr w:type="gramStart"/>
-      <w:r>
-        <w:t>il proprio team</w:t>
-      </w:r>
-      <w:proofErr w:type="gramEnd"/>
-      <w:r>
-        <w:t xml:space="preserve"> e ne amministra le attività principali. Questo ruolo gli permette di iscrivere o disiscrivere il gruppo da un hackathon, invitare nuovi utenti a farne parte e modificare in qualsiasi momento le informazioni relative </w:t>
-      </w:r>
-      <w:proofErr w:type="gramStart"/>
-      <w:r>
-        <w:t>al team stesso</w:t>
-      </w:r>
-      <w:proofErr w:type="gramEnd"/>
-      <w:r>
-        <w:t>.</w:t>
-      </w:r>
-    </w:p>
-    <w:p>
-      <w:pPr>
-        <w:pStyle w:val="Heading4"/>
-      </w:pPr>
-      <w:r>
-        <w:t xml:space="preserve">Membro </w:t>
-      </w:r>
-      <w:proofErr w:type="gramStart"/>
-      <w:r>
-        <w:t>del team</w:t>
-      </w:r>
-      <w:proofErr w:type="gramEnd"/>
-    </w:p>
-    <w:p>
-      <w:r>
-        <w:t>Il Membro del Team ha accesso alla consultazione di tutti gli hackathon disponibili sulla piattaforma. A livello operativo, per le competizioni a cui partecipa, può inviare la sottomissione del progetto e aggiornarla con eventuali modifiche, a patto che tali operazioni avvengano rigorosamente entro la scadenza prevista dall'evento.</w:t>
-      </w:r>
-    </w:p>
-    <w:p>
-      <w:pPr>
-        <w:pStyle w:val="Heading4"/>
+        <w:t>Il Team Leader è colui che ha creato il proprio team e ne amministra le attività principali</w:t>
+      </w:r>
+      <w:r>
+        <w:t>: iscrizione/disiscrizione ad</w:t>
+      </w:r>
+      <w:r>
+        <w:t xml:space="preserve"> un hackathon</w:t>
+      </w:r>
+      <w:r>
+        <w:t>,</w:t>
+      </w:r>
+      <w:r>
+        <w:t xml:space="preserve"> </w:t>
+      </w:r>
+      <w:r>
+        <w:t>gestione inviti di</w:t>
+      </w:r>
+      <w:r>
+        <w:t xml:space="preserve"> nuovi </w:t>
+      </w:r>
+      <w:r>
+        <w:t xml:space="preserve">membri </w:t>
+      </w:r>
+      <w:r>
+        <w:t xml:space="preserve">e </w:t>
+      </w:r>
+      <w:r>
+        <w:t>modifica</w:t>
+      </w:r>
+      <w:r>
+        <w:t xml:space="preserve"> </w:t>
+      </w:r>
+      <w:r>
+        <w:t>del</w:t>
+      </w:r>
+      <w:r>
+        <w:t>le informazioni relative al team stesso.</w:t>
+      </w:r>
+    </w:p>
+    <w:p>
+      <w:pPr>
+        <w:pStyle w:val="Titolo5"/>
+      </w:pPr>
+      <w:r>
+        <w:t>Membro del team</w:t>
+      </w:r>
+    </w:p>
+    <w:p>
+      <w:r>
+        <w:t xml:space="preserve">Il Membro del Team </w:t>
+      </w:r>
+      <w:r>
+        <w:rPr>
+          <w:highlight w:val="black"/>
+        </w:rPr>
+        <w:t>ha accesso alla consultazione di tutti gli hackathon disponibili sulla piattaforma. A livello operativo</w:t>
+      </w:r>
+      <w:r>
+        <w:t xml:space="preserve">, per le competizioni a cui partecipa, può inviare la sottomissione del progetto e aggiornarla con eventuali modifiche, </w:t>
+      </w:r>
+      <w:r>
+        <w:rPr>
+          <w:highlight w:val="black"/>
+        </w:rPr>
+        <w:t>a patto che tali operazioni avvengano rigorosamente</w:t>
+      </w:r>
+      <w:r>
+        <w:t xml:space="preserve"> entro la scadenza prevista dall'evento.</w:t>
+      </w:r>
+    </w:p>
+    <w:p>
+      <w:pPr>
+        <w:pStyle w:val="Titolo4"/>
       </w:pPr>
       <w:r>
         <w:t>Staff</w:t>
       </w:r>
     </w:p>
     <w:p>
-      <w:pPr>
-        <w:jc w:val="both"/>
-      </w:pPr>
       <w:r>
         <w:t>I</w:t>
       </w:r>
       <w:r>
-        <w:t>l Membro dello Staff è il personale</w:t>
-      </w:r>
-      <w:r>
-        <w:t xml:space="preserve"> che può essere</w:t>
-      </w:r>
-      <w:r>
-        <w:t xml:space="preserve"> assegnato a uno specifico hackathon e può ricoprire la figura di Organizzatore, Giudice o Mentore.</w:t>
-      </w:r>
-    </w:p>
-    <w:p>
-      <w:pPr>
-        <w:pStyle w:val="Heading4"/>
+        <w:t xml:space="preserve">l Membro dello Staff è il personale che può essere assegnato a uno specifico hackathon e può ricoprire </w:t>
+      </w:r>
+      <w:r>
+        <w:t xml:space="preserve">il ruolo </w:t>
+      </w:r>
+      <w:r>
+        <w:t xml:space="preserve">di Organizzatore, Giudice </w:t>
+      </w:r>
+      <w:r>
+        <w:t>e/</w:t>
+      </w:r>
+      <w:r>
+        <w:t>o Mentore.</w:t>
+      </w:r>
+    </w:p>
+    <w:p>
+      <w:pPr>
+        <w:pStyle w:val="Titolo5"/>
       </w:pPr>
       <w:r>
         <w:t>Mentore</w:t>
       </w:r>
     </w:p>
     <w:p>
-      <w:pPr>
-        <w:jc w:val="both"/>
-      </w:pPr>
-      <w:r>
-        <w:t xml:space="preserve">Il mentore è un membro dello staff assegnato a uno specifico hackathon dall'organizzatore. Ha il compito di affiancare </w:t>
-      </w:r>
-      <w:proofErr w:type="gramStart"/>
-      <w:r>
-        <w:t>i team</w:t>
-      </w:r>
-      <w:proofErr w:type="gramEnd"/>
-      <w:r>
-        <w:t xml:space="preserve"> durante lo svolgimento dell'evento. </w:t>
-      </w:r>
-      <w:r>
-        <w:t xml:space="preserve">Attraverso la piattaforma può monitorare l’andamento delle attività e, qualora rilevi violazioni del regolamento da parte di </w:t>
-      </w:r>
-      <w:proofErr w:type="gramStart"/>
-      <w:r>
-        <w:t>un team</w:t>
-      </w:r>
-      <w:proofErr w:type="gramEnd"/>
-      <w:r>
-        <w:t>, ha la possibilità di segnalarle all’organizzatore, che prenderà le decisioni opportune.</w:t>
-      </w:r>
-    </w:p>
-    <w:p>
-      <w:pPr>
-        <w:pStyle w:val="Heading4"/>
+      <w:r>
+        <w:t xml:space="preserve">Il mentore </w:t>
+      </w:r>
+      <w:r>
+        <w:rPr>
+          <w:highlight w:val="black"/>
+        </w:rPr>
+        <w:t>è un membro dello staff assegnato a uno specifico hackathon dall'organizzatore.</w:t>
+      </w:r>
+      <w:r>
+        <w:t xml:space="preserve"> Ha il compito di affiancare i team durante lo svolgimento dell'evento. </w:t>
+      </w:r>
+      <w:r>
+        <w:t>Attraverso la piattaforma può monitorare l’andamento delle attività e, qualora rilevi violazioni del regolamento da parte di un team, ha la possibilità di segnalarle all’organizzatore, che prenderà le decisioni opportune.</w:t>
+      </w:r>
+    </w:p>
+    <w:p>
+      <w:pPr>
+        <w:pStyle w:val="Titolo5"/>
       </w:pPr>
       <w:r>
         <w:t>Giudice</w:t>
       </w:r>
     </w:p>
     <w:p>
-      <w:pPr>
-        <w:jc w:val="both"/>
-      </w:pPr>
-      <w:r>
-        <w:t xml:space="preserve">Il giudice è il membro dello staff incaricato di valutare le sottomissioni nella fase conclusiva dell'hackathon. Può visualizzare tutte le sottomissioni </w:t>
-      </w:r>
-      <w:proofErr w:type="gramStart"/>
-      <w:r>
-        <w:t>dei team relative</w:t>
-      </w:r>
-      <w:proofErr w:type="gramEnd"/>
-      <w:r>
-        <w:t xml:space="preserve"> all'evento cui è stato assegnato. Per ciascuna sottomissione, il giudice rilascia una valutazione composta da un punteggio numerico compreso tra 0 e 10 e da un breve giudizio scritto che motiva la valutazione.</w:t>
-      </w:r>
-    </w:p>
-    <w:p>
-      <w:pPr>
-        <w:pStyle w:val="Heading4"/>
+      <w:r>
+        <w:t xml:space="preserve">Il giudice </w:t>
+      </w:r>
+      <w:r>
+        <w:rPr>
+          <w:highlight w:val="black"/>
+        </w:rPr>
+        <w:t>è il membro dello staff incaricato di valutare le sottomissioni nella fase conclusiva dell'hackathon.</w:t>
+      </w:r>
+      <w:r>
+        <w:t xml:space="preserve"> Può visualizzare tutte le sottomissioni dei team relative all'evento cui è stato assegnato</w:t>
+      </w:r>
+      <w:r>
+        <w:t xml:space="preserve"> e</w:t>
+      </w:r>
+      <w:r>
+        <w:t xml:space="preserve"> </w:t>
+      </w:r>
+      <w:r>
+        <w:t>p</w:t>
+      </w:r>
+      <w:r>
+        <w:t xml:space="preserve">er ciascuna </w:t>
+      </w:r>
+      <w:r>
+        <w:t>di essa rilasciare</w:t>
+      </w:r>
+      <w:r>
+        <w:t xml:space="preserve"> una valutazione composta da</w:t>
+      </w:r>
+      <w:r>
+        <w:t>:</w:t>
+      </w:r>
+      <w:r>
+        <w:t xml:space="preserve"> un punteggio numerico</w:t>
+      </w:r>
+      <w:r>
+        <w:t xml:space="preserve">, </w:t>
+      </w:r>
+      <w:r>
+        <w:t>compreso tra 0 e 10</w:t>
+      </w:r>
+      <w:r>
+        <w:t>,</w:t>
+      </w:r>
+      <w:r>
+        <w:t xml:space="preserve"> e da un breve giudizio scritto che motiva la valutazione.</w:t>
+      </w:r>
+    </w:p>
+    <w:p>
+      <w:pPr>
+        <w:pStyle w:val="Titolo5"/>
       </w:pPr>
       <w:r>
         <w:t>Organizzatore</w:t>
       </w:r>
     </w:p>
     <w:p>
-      <w:pPr>
-        <w:jc w:val="both"/>
-      </w:pPr>
-      <w:r>
-        <w:t>L'organizzatore è il membro dello staff con le maggiori responsabilità all'interno della piattaforma. Crea nuovi hackathon definendo tutte le informazioni essenziali dell'evento</w:t>
+      <w:r>
+        <w:t xml:space="preserve">L'organizzatore </w:t>
+      </w:r>
+      <w:r>
+        <w:rPr>
+          <w:highlight w:val="black"/>
+        </w:rPr>
+        <w:t>è il membro dello staff con le maggiori responsabilità all'interno della piattaforma.</w:t>
+      </w:r>
+      <w:r>
+        <w:t xml:space="preserve"> Crea nuovi hackathon definendo tutte le informazioni essenziali dell'evento</w:t>
       </w:r>
       <w:r>
         <w:t xml:space="preserve">. </w:t>
       </w:r>
       <w:r>
-        <w:t xml:space="preserve">Può aggiungere ulteriori mentori anche dopo la creazione dell'hackathon. Quando tutte le sottomissioni di un hackathon sono state valutate dal giudice, l'organizzatore proclama </w:t>
-      </w:r>
-      <w:proofErr w:type="gramStart"/>
-      <w:r>
-        <w:t>un solo team vincitore</w:t>
-      </w:r>
-      <w:proofErr w:type="gramEnd"/>
-      <w:r>
-        <w:t>.</w:t>
-      </w:r>
-    </w:p>
-    <w:p>
-      <w:pPr>
-        <w:pStyle w:val="Heading3"/>
+        <w:t>Può aggiungere ulteriori mentori anche dopo la creazione dell'hackathon. Quando tutte le sottomissioni di un hackathon sono state valutate dal giudice, l'organizzatore proclama un solo team vincitore.</w:t>
+      </w:r>
+    </w:p>
+    <w:p>
+      <w:pPr>
+        <w:jc w:val="left"/>
+        <w:rPr>
+          <w:rFonts w:eastAsiaTheme="majorEastAsia" w:cstheme="majorBidi"/>
+          <w:color w:val="0F4761" w:themeColor="accent1" w:themeShade="BF"/>
+          <w:sz w:val="28"/>
+          <w:szCs w:val="28"/>
+        </w:rPr>
+      </w:pPr>
+    </w:p>
+    <w:p>
+      <w:pPr>
+        <w:pStyle w:val="Titolo3"/>
       </w:pPr>
       <w:r>
         <w:t>Ciclo di Vita di un Hackathon</w:t>
       </w:r>
     </w:p>
     <w:p>
-      <w:pPr>
-        <w:jc w:val="both"/>
-      </w:pPr>
       <w:r>
         <w:t>Ogni hackathon attraversa quattro stati distinti che ne determinano le funzionalità disponibili per i vari attori:</w:t>
       </w:r>
     </w:p>
     <w:tbl>
       <w:tblPr>
-        <w:tblStyle w:val="GridTable4-Accent1"/>
+        <w:tblStyle w:val="Tabellagriglia4-colore1"/>
         <w:tblW w:w="0" w:type="auto"/>
         <w:tblLook w:val="04A0" w:firstRow="1" w:lastRow="0" w:firstColumn="1" w:lastColumn="0" w:noHBand="0" w:noVBand="1"/>
       </w:tblPr>
@@ -507,9 +612,6 @@
             <w:tcW w:w="3208" w:type="dxa"/>
           </w:tcPr>
           <w:p>
-            <w:pPr>
-              <w:jc w:val="both"/>
-            </w:pPr>
             <w:r>
               <w:t>Stato</w:t>
             </w:r>
@@ -521,7 +623,6 @@
           </w:tcPr>
           <w:p>
             <w:pPr>
-              <w:jc w:val="both"/>
               <w:cnfStyle w:val="100000000000" w:firstRow="1" w:lastRow="0" w:firstColumn="0" w:lastColumn="0" w:oddVBand="0" w:evenVBand="0" w:oddHBand="0" w:evenHBand="0" w:firstRowFirstColumn="0" w:firstRowLastColumn="0" w:lastRowFirstColumn="0" w:lastRowLastColumn="0"/>
             </w:pPr>
             <w:r>
@@ -535,7 +636,6 @@
           </w:tcPr>
           <w:p>
             <w:pPr>
-              <w:jc w:val="both"/>
               <w:cnfStyle w:val="100000000000" w:firstRow="1" w:lastRow="0" w:firstColumn="0" w:lastColumn="0" w:oddVBand="0" w:evenVBand="0" w:oddHBand="0" w:evenHBand="0" w:firstRowFirstColumn="0" w:firstRowLastColumn="0" w:lastRowFirstColumn="0" w:lastRowLastColumn="0"/>
             </w:pPr>
             <w:r>
@@ -555,11 +655,7 @@
             <w:hideMark/>
           </w:tcPr>
           <w:p>
-            <w:pPr>
-              <w:jc w:val="both"/>
-            </w:pPr>
             <w:r>
-              <w:lastRenderedPageBreak/>
               <w:t>REGISTRATION</w:t>
             </w:r>
           </w:p>
@@ -571,7 +667,6 @@
           </w:tcPr>
           <w:p>
             <w:pPr>
-              <w:jc w:val="both"/>
               <w:cnfStyle w:val="000000100000" w:firstRow="0" w:lastRow="0" w:firstColumn="0" w:lastColumn="0" w:oddVBand="0" w:evenVBand="0" w:oddHBand="1" w:evenHBand="0" w:firstRowFirstColumn="0" w:firstRowLastColumn="0" w:lastRowFirstColumn="0" w:lastRowLastColumn="0"/>
             </w:pPr>
             <w:r>
@@ -586,16 +681,10 @@
           </w:tcPr>
           <w:p>
             <w:pPr>
-              <w:jc w:val="both"/>
               <w:cnfStyle w:val="000000100000" w:firstRow="0" w:lastRow="0" w:firstColumn="0" w:lastColumn="0" w:oddVBand="0" w:evenVBand="0" w:oddHBand="1" w:evenHBand="0" w:firstRowFirstColumn="0" w:firstRowLastColumn="0" w:lastRowFirstColumn="0" w:lastRowLastColumn="0"/>
             </w:pPr>
-            <w:proofErr w:type="gramStart"/>
             <w:r>
-              <w:t>I team</w:t>
-            </w:r>
-            <w:proofErr w:type="gramEnd"/>
-            <w:r>
-              <w:t xml:space="preserve"> si iscrivono all'evento</w:t>
+              <w:t>I team si iscrivono all'evento</w:t>
             </w:r>
           </w:p>
         </w:tc>
@@ -608,9 +697,6 @@
             <w:hideMark/>
           </w:tcPr>
           <w:p>
-            <w:pPr>
-              <w:jc w:val="both"/>
-            </w:pPr>
             <w:r>
               <w:t>ONGOING</w:t>
             </w:r>
@@ -623,7 +709,6 @@
           </w:tcPr>
           <w:p>
             <w:pPr>
-              <w:jc w:val="both"/>
               <w:cnfStyle w:val="000000000000" w:firstRow="0" w:lastRow="0" w:firstColumn="0" w:lastColumn="0" w:oddVBand="0" w:evenVBand="0" w:oddHBand="0" w:evenHBand="0" w:firstRowFirstColumn="0" w:firstRowLastColumn="0" w:lastRowFirstColumn="0" w:lastRowLastColumn="0"/>
             </w:pPr>
             <w:r>
@@ -638,16 +723,10 @@
           </w:tcPr>
           <w:p>
             <w:pPr>
-              <w:jc w:val="both"/>
               <w:cnfStyle w:val="000000000000" w:firstRow="0" w:lastRow="0" w:firstColumn="0" w:lastColumn="0" w:oddVBand="0" w:evenVBand="0" w:oddHBand="0" w:evenHBand="0" w:firstRowFirstColumn="0" w:firstRowLastColumn="0" w:lastRowFirstColumn="0" w:lastRowLastColumn="0"/>
             </w:pPr>
-            <w:proofErr w:type="gramStart"/>
             <w:r>
-              <w:t>I team</w:t>
-            </w:r>
-            <w:proofErr w:type="gramEnd"/>
-            <w:r>
-              <w:t xml:space="preserve"> lavorano e caricano le sottomissioni</w:t>
+              <w:t>I team lavorano e caricano le sottomissioni</w:t>
             </w:r>
           </w:p>
         </w:tc>
@@ -663,9 +742,6 @@
             <w:hideMark/>
           </w:tcPr>
           <w:p>
-            <w:pPr>
-              <w:jc w:val="both"/>
-            </w:pPr>
             <w:r>
               <w:t>EVALUATION</w:t>
             </w:r>
@@ -678,7 +754,6 @@
           </w:tcPr>
           <w:p>
             <w:pPr>
-              <w:jc w:val="both"/>
               <w:cnfStyle w:val="000000100000" w:firstRow="0" w:lastRow="0" w:firstColumn="0" w:lastColumn="0" w:oddVBand="0" w:evenVBand="0" w:oddHBand="1" w:evenHBand="0" w:firstRowFirstColumn="0" w:firstRowLastColumn="0" w:lastRowFirstColumn="0" w:lastRowLastColumn="0"/>
             </w:pPr>
             <w:r>
@@ -693,17 +768,11 @@
           </w:tcPr>
           <w:p>
             <w:pPr>
-              <w:jc w:val="both"/>
               <w:cnfStyle w:val="000000100000" w:firstRow="0" w:lastRow="0" w:firstColumn="0" w:lastColumn="0" w:oddVBand="0" w:evenVBand="0" w:oddHBand="1" w:evenHBand="0" w:firstRowFirstColumn="0" w:firstRowLastColumn="0" w:lastRowFirstColumn="0" w:lastRowLastColumn="0"/>
             </w:pPr>
             <w:r>
-              <w:t xml:space="preserve">Il giudice valuta le sottomissioni </w:t>
+              <w:t>Il giudice valuta le sottomissioni dei team</w:t>
             </w:r>
-            <w:proofErr w:type="gramStart"/>
-            <w:r>
-              <w:t>dei team</w:t>
-            </w:r>
-            <w:proofErr w:type="gramEnd"/>
           </w:p>
         </w:tc>
       </w:tr>
@@ -715,11 +784,8 @@
             <w:hideMark/>
           </w:tcPr>
           <w:p>
-            <w:pPr>
-              <w:jc w:val="both"/>
-            </w:pPr>
             <w:r>
-              <w:t>CLOSED</w:t>
+              <w:t>COMPLETED</w:t>
             </w:r>
           </w:p>
         </w:tc>
@@ -730,7 +796,6 @@
           </w:tcPr>
           <w:p>
             <w:pPr>
-              <w:jc w:val="both"/>
               <w:cnfStyle w:val="000000000000" w:firstRow="0" w:lastRow="0" w:firstColumn="0" w:lastColumn="0" w:oddVBand="0" w:evenVBand="0" w:oddHBand="0" w:evenHBand="0" w:firstRowFirstColumn="0" w:firstRowLastColumn="0" w:lastRowFirstColumn="0" w:lastRowLastColumn="0"/>
             </w:pPr>
             <w:r>
@@ -745,7 +810,6 @@
           </w:tcPr>
           <w:p>
             <w:pPr>
-              <w:jc w:val="both"/>
               <w:cnfStyle w:val="000000000000" w:firstRow="0" w:lastRow="0" w:firstColumn="0" w:lastColumn="0" w:oddVBand="0" w:evenVBand="0" w:oddHBand="0" w:evenHBand="0" w:firstRowFirstColumn="0" w:firstRowLastColumn="0" w:lastRowFirstColumn="0" w:lastRowLastColumn="0"/>
             </w:pPr>
             <w:r>
@@ -757,36 +821,72 @@
     </w:tbl>
     <w:p>
       <w:pPr>
-        <w:jc w:val="both"/>
-      </w:pPr>
-    </w:p>
-    <w:p>
-      <w:pPr>
-        <w:jc w:val="both"/>
-      </w:pPr>
-      <w:r>
+        <w:rPr>
+          <w:highlight w:val="black"/>
+        </w:rPr>
+      </w:pPr>
+    </w:p>
+    <w:p>
+      <w:r>
+        <w:rPr>
+          <w:highlight w:val="black"/>
+        </w:rPr>
+        <w:lastRenderedPageBreak/>
         <w:t>La transizione tra gli stati è gestita dall'organizzatore, che controlla manualmente l'avanzamento del ciclo di vita in base all'andamento dell'evento. Il sistema verifica le precondizioni necessarie prima di consentire la transizione: ad esempio, non è possibile proclamare un vincitore finché non tutte le sottomissioni sono state valutate dal giudice.</w:t>
       </w:r>
     </w:p>
     <w:p>
-      <w:pPr>
-        <w:pStyle w:val="Heading2"/>
+      <w:r>
+        <w:rPr>
+          <w:highlight w:val="yellow"/>
+        </w:rPr>
+        <w:t xml:space="preserve">La transazione tra i vari stati avviene automaticamente sulla base della data di inizio e fine assegnata all’hackathon. L’unica eccezione è rappresentata dal passaggio dallo stato Evaluation a </w:t>
+      </w:r>
+      <w:proofErr w:type="spellStart"/>
+      <w:r>
+        <w:rPr>
+          <w:highlight w:val="yellow"/>
+        </w:rPr>
+        <w:t>Completed</w:t>
+      </w:r>
+      <w:proofErr w:type="spellEnd"/>
+      <w:r>
+        <w:rPr>
+          <w:highlight w:val="yellow"/>
+        </w:rPr>
+        <w:t xml:space="preserve"> che </w:t>
+      </w:r>
+      <w:proofErr w:type="spellStart"/>
+      <w:r>
+        <w:rPr>
+          <w:highlight w:val="yellow"/>
+        </w:rPr>
+        <w:t>avverà</w:t>
+      </w:r>
+      <w:proofErr w:type="spellEnd"/>
+      <w:r>
+        <w:rPr>
+          <w:highlight w:val="yellow"/>
+        </w:rPr>
+        <w:t xml:space="preserve"> quando l’organizzatore proclamerà il vincitore.</w:t>
+      </w:r>
+    </w:p>
+    <w:p>
+      <w:pPr>
+        <w:pStyle w:val="Titolo2"/>
       </w:pPr>
       <w:r>
         <w:t xml:space="preserve">Architettura </w:t>
       </w:r>
     </w:p>
     <w:p>
-      <w:pPr>
-        <w:jc w:val="both"/>
-      </w:pPr>
       <w:r>
         <w:t>Il sistema è progettato seguendo un'architettura a tre livelli ben separati, che garantisce modularità, manutenibilità e scalabilità:</w:t>
       </w:r>
     </w:p>
     <w:p>
       <w:pPr>
-        <w:pStyle w:val="Heading4"/>
+        <w:pStyle w:val="Titolo4"/>
       </w:pPr>
       <w:r>
         <w:t xml:space="preserve">Presentation Layer — </w:t>
@@ -798,9 +898,6 @@
       <w:proofErr w:type="spellEnd"/>
     </w:p>
     <w:p>
-      <w:pPr>
-        <w:jc w:val="both"/>
-      </w:pPr>
       <w:r>
         <w:t xml:space="preserve">Il livello di presentazione è costituito da una Single Page Application (SPA) sviluppata con </w:t>
       </w:r>
@@ -826,21 +923,24 @@
       </w:r>
       <w:proofErr w:type="spellEnd"/>
       <w:r>
-        <w:t xml:space="preserve"> esclusivamente tramite chiamate HTTP alle API REST esposte dal server, senza alcuna conoscenza della logica di business sottostante. Tutte le operazioni di visualizzazione, navigazione e interazione con l'utente sono gestite interamente lato client, con aggiornamenti parziali della pagina senza necessità di ricaricarla completamente.</w:t>
-      </w:r>
-    </w:p>
-    <w:p>
-      <w:pPr>
-        <w:pStyle w:val="Heading4"/>
+        <w:t xml:space="preserve"> esclusivamente tramite chiamate HTTP alle API REST esposte dal server</w:t>
+      </w:r>
+      <w:r>
+        <w:rPr>
+          <w:highlight w:val="black"/>
+        </w:rPr>
+        <w:t>, senza alcuna conoscenza della logica di business sottostante. Tutte le operazioni di visualizzazione, navigazione e interazione con l'utente sono gestite interamente lato client, con aggiornamenti parziali della pagina senza necessità di ricaricarla completamente.</w:t>
+      </w:r>
+    </w:p>
+    <w:p>
+      <w:pPr>
+        <w:pStyle w:val="Titolo4"/>
       </w:pPr>
       <w:r>
         <w:t>Business Logic Layer — Backend</w:t>
       </w:r>
     </w:p>
     <w:p>
-      <w:pPr>
-        <w:jc w:val="both"/>
-      </w:pPr>
       <w:r>
         <w:t xml:space="preserve">Il livello di logica applicativa è sviluppato in Java con il framework Spring Boot. È responsabile dell'elaborazione delle richieste provenienti dal </w:t>
       </w:r>
@@ -850,23 +950,35 @@
       </w:r>
       <w:proofErr w:type="spellEnd"/>
       <w:r>
-        <w:t>, della validazione dei dati, dell'applicazione delle regole di business e della gestione della sicurezza. Espone un'API REST che costituisce l'unico punto di accesso ai dati e alle funzionalità dell'applicazione.</w:t>
-      </w:r>
-    </w:p>
-    <w:p>
-      <w:pPr>
-        <w:pStyle w:val="Heading4"/>
+        <w:t xml:space="preserve">, della validazione dei dati, dell'applicazione delle regole di business e della gestione della sicurezza. </w:t>
+      </w:r>
+      <w:r>
+        <w:rPr>
+          <w:highlight w:val="black"/>
+        </w:rPr>
+        <w:t>Espone un'API REST che costituisce l'unico punto di accesso ai dati e alle funzionalità dell'applicazione.</w:t>
+      </w:r>
+    </w:p>
+    <w:p>
+      <w:pPr>
+        <w:pStyle w:val="Titolo4"/>
       </w:pPr>
       <w:r>
         <w:t>Data Layer — Persistenza</w:t>
       </w:r>
     </w:p>
     <w:p>
-      <w:pPr>
-        <w:jc w:val="both"/>
-      </w:pPr>
-      <w:r>
-        <w:t>Il livello di persistenza è gestito tramite Spring Data JPA con database H2 in memoria. Questo livello si occupa esclusivamente della memorizzazione e del recupero dei dati, senza contenere alcuna logica applicativa. L'utilizzo di H2 in modalità in-</w:t>
+      <w:r>
+        <w:t xml:space="preserve">Il livello di persistenza è gestito tramite Spring Data JPA con database H2 in memoria. </w:t>
+      </w:r>
+      <w:r>
+        <w:rPr>
+          <w:highlight w:val="black"/>
+        </w:rPr>
+        <w:t>Questo livello si occupa esclusivamente della memorizzazione e del recupero dei dati, senza contenere alcuna logica applicativa.</w:t>
+      </w:r>
+      <w:r>
+        <w:t xml:space="preserve"> L'utilizzo di H2 in modalità in-</w:t>
       </w:r>
       <w:proofErr w:type="spellStart"/>
       <w:r>
@@ -879,7 +991,7 @@
     </w:p>
     <w:p>
       <w:pPr>
-        <w:pStyle w:val="Heading2"/>
+        <w:pStyle w:val="Titolo2"/>
       </w:pPr>
       <w:r>
         <w:t>Tecnologie Utilizzate</w:t>
@@ -887,16 +999,13 @@
     </w:p>
     <w:p>
       <w:pPr>
-        <w:pStyle w:val="Heading4"/>
+        <w:pStyle w:val="Titolo4"/>
       </w:pPr>
       <w:r>
         <w:t>Backend — Java &amp; Spring Boot</w:t>
       </w:r>
     </w:p>
     <w:p>
-      <w:pPr>
-        <w:jc w:val="both"/>
-      </w:pPr>
       <w:r>
         <w:t xml:space="preserve">Il </w:t>
       </w:r>
@@ -908,25 +1017,17 @@
       <w:r>
         <w:t xml:space="preserve"> è sviluppato in Java </w:t>
       </w:r>
-      <w:proofErr w:type="gramStart"/>
       <w:r>
         <w:t xml:space="preserve">21 </w:t>
       </w:r>
       <w:r>
-        <w:t xml:space="preserve"> ed</w:t>
-      </w:r>
-      <w:proofErr w:type="gramEnd"/>
-      <w:r>
-        <w:t xml:space="preserve"> utilizza il framework Spring Boot</w:t>
+        <w:t xml:space="preserve"> ed utilizza il framework Spring Boot</w:t>
       </w:r>
       <w:r>
         <w:t>.</w:t>
       </w:r>
     </w:p>
     <w:p>
-      <w:pPr>
-        <w:jc w:val="both"/>
-      </w:pPr>
       <w:r>
         <w:t>I moduli Spring impiegati nel progetto sono:</w:t>
       </w:r>
@@ -937,14 +1038,12 @@
           <w:ilvl w:val="0"/>
           <w:numId w:val="2"/>
         </w:numPr>
-        <w:jc w:val="both"/>
       </w:pPr>
       <w:r>
         <w:rPr>
           <w:b/>
           <w:bCs/>
         </w:rPr>
-        <w:lastRenderedPageBreak/>
         <w:t xml:space="preserve">Spring Web: </w:t>
       </w:r>
       <w:r>
@@ -957,7 +1056,6 @@
           <w:ilvl w:val="0"/>
           <w:numId w:val="2"/>
         </w:numPr>
-        <w:jc w:val="both"/>
       </w:pPr>
       <w:r>
         <w:rPr>
@@ -967,12 +1065,24 @@
         <w:t xml:space="preserve">Spring Security: </w:t>
       </w:r>
       <w:r>
-        <w:t>gestione dell'autenticazione e dell'autorizzazione. L'accesso alle risorse protette è regolato in base al ruolo</w:t>
-      </w:r>
-      <w:r>
+        <w:t xml:space="preserve">gestione dell'autenticazione e dell'autorizzazione. </w:t>
+      </w:r>
+      <w:r>
+        <w:rPr>
+          <w:highlight w:val="black"/>
+        </w:rPr>
+        <w:t>L'accesso alle risorse protette è regolato in base al ruolo</w:t>
+      </w:r>
+      <w:r>
+        <w:rPr>
+          <w:highlight w:val="black"/>
+        </w:rPr>
         <w:t xml:space="preserve"> (statico) </w:t>
       </w:r>
       <w:r>
+        <w:rPr>
+          <w:highlight w:val="black"/>
+        </w:rPr>
         <w:t>dell'utente (USER, STAFF, ADMIN), con protezione degli endpoint tramite filtri di sicurezza e token JWT (JSON Web Token).</w:t>
       </w:r>
     </w:p>
@@ -982,7 +1092,6 @@
           <w:ilvl w:val="0"/>
           <w:numId w:val="2"/>
         </w:numPr>
-        <w:jc w:val="both"/>
       </w:pPr>
       <w:r>
         <w:rPr>
@@ -992,7 +1101,32 @@
         <w:t xml:space="preserve">Spring Data JPA: </w:t>
       </w:r>
       <w:r>
-        <w:t xml:space="preserve">astrazione del livello di persistenza tramite repository tipizzati. Permette di interagire con il database attraverso interfacce dichiarative senza scrivere query SQL manualmente, sfruttando </w:t>
+        <w:t xml:space="preserve">astrazione del livello di persistenza tramite repository tipizzati. Permette di interagire con il database attraverso </w:t>
+      </w:r>
+      <w:r>
+        <w:rPr>
+          <w:highlight w:val="black"/>
+        </w:rPr>
+        <w:t xml:space="preserve">interfacce dichiarative senza scrivere query SQL </w:t>
+      </w:r>
+      <w:r>
+        <w:rPr>
+          <w:highlight w:val="black"/>
+        </w:rPr>
+        <w:lastRenderedPageBreak/>
+        <w:t>manualmente</w:t>
+      </w:r>
+      <w:r>
+        <w:t xml:space="preserve"> </w:t>
+      </w:r>
+      <w:r>
+        <w:rPr>
+          <w:highlight w:val="yellow"/>
+        </w:rPr>
+        <w:t>un approccio ORM</w:t>
+      </w:r>
+      <w:r>
+        <w:t xml:space="preserve">, sfruttando </w:t>
       </w:r>
       <w:proofErr w:type="spellStart"/>
       <w:r>
@@ -1009,7 +1143,6 @@
           <w:ilvl w:val="0"/>
           <w:numId w:val="2"/>
         </w:numPr>
-        <w:jc w:val="both"/>
       </w:pPr>
       <w:r>
         <w:rPr>
@@ -1019,13 +1152,25 @@
         <w:t xml:space="preserve">H2 Database: </w:t>
       </w:r>
       <w:r>
-        <w:t>database relazionale in memoria, utilizzato durante lo sviluppo. Offre una console web accessibile durante l'esecuzione per ispezionare i dati in tempo reale, senza installare un DBMS esterno.</w:t>
-      </w:r>
-    </w:p>
-    <w:p>
-      <w:pPr>
-        <w:jc w:val="both"/>
-      </w:pPr>
+        <w:t>database relazionale in memoria</w:t>
+      </w:r>
+      <w:r>
+        <w:rPr>
+          <w:highlight w:val="black"/>
+        </w:rPr>
+        <w:t>, utilizzato durante lo sviluppo.</w:t>
+      </w:r>
+      <w:r>
+        <w:t xml:space="preserve"> </w:t>
+      </w:r>
+      <w:r>
+        <w:rPr>
+          <w:highlight w:val="black"/>
+        </w:rPr>
+        <w:t>Offre una console web accessibile durante l'esecuzione per ispezionare i dati in tempo reale, senza installare un DBMS esterno.</w:t>
+      </w:r>
+    </w:p>
+    <w:p>
       <w:r>
         <w:t xml:space="preserve">La build e la gestione delle dipendenze del progetto </w:t>
       </w:r>
@@ -1035,12 +1180,21 @@
       </w:r>
       <w:proofErr w:type="spellEnd"/>
       <w:r>
-        <w:t xml:space="preserve"> sono affidate ad Apache Maven, che si occupa della risoluzione delle librerie, della compilazione del codice sorgente e del packaging dell'applicazione in un archivio JAR eseguibile.</w:t>
-      </w:r>
-    </w:p>
-    <w:p>
-      <w:pPr>
-        <w:pStyle w:val="Heading4"/>
+        <w:t xml:space="preserve"> sono affidate ad Apache Maven, che si occupa della risoluzione delle librerie, della compilazione del codice sorgente e del packaging dell'applicazione </w:t>
+      </w:r>
+      <w:r>
+        <w:rPr>
+          <w:highlight w:val="black"/>
+        </w:rPr>
+        <w:t>in un archivio JAR eseguibile</w:t>
+      </w:r>
+      <w:r>
+        <w:t>.</w:t>
+      </w:r>
+    </w:p>
+    <w:p>
+      <w:pPr>
+        <w:pStyle w:val="Titolo4"/>
       </w:pPr>
       <w:proofErr w:type="spellStart"/>
       <w:r>
@@ -1057,9 +1211,6 @@
       <w:proofErr w:type="spellEnd"/>
     </w:p>
     <w:p>
-      <w:pPr>
-        <w:jc w:val="both"/>
-      </w:pPr>
       <w:r>
         <w:t xml:space="preserve">Il </w:t>
       </w:r>
@@ -1118,17 +1269,28 @@
     </w:p>
     <w:p>
       <w:pPr>
-        <w:jc w:val="both"/>
-      </w:pPr>
-      <w:r>
+        <w:rPr>
+          <w:highlight w:val="black"/>
+        </w:rPr>
+      </w:pPr>
+      <w:r>
+        <w:rPr>
+          <w:highlight w:val="black"/>
+        </w:rPr>
         <w:t xml:space="preserve">Le principali tecnologie e scelte architetturali del </w:t>
       </w:r>
       <w:proofErr w:type="spellStart"/>
       <w:r>
+        <w:rPr>
+          <w:highlight w:val="black"/>
+        </w:rPr>
         <w:t>frontend</w:t>
       </w:r>
       <w:proofErr w:type="spellEnd"/>
       <w:r>
+        <w:rPr>
+          <w:highlight w:val="black"/>
+        </w:rPr>
         <w:t xml:space="preserve"> includono:</w:t>
       </w:r>
     </w:p>
@@ -1138,13 +1300,16 @@
           <w:ilvl w:val="0"/>
           <w:numId w:val="2"/>
         </w:numPr>
-        <w:jc w:val="both"/>
+        <w:rPr>
+          <w:highlight w:val="black"/>
+        </w:rPr>
       </w:pPr>
       <w:proofErr w:type="spellStart"/>
       <w:r>
         <w:rPr>
           <w:b/>
           <w:bCs/>
+          <w:highlight w:val="black"/>
         </w:rPr>
         <w:t>TypeScript</w:t>
       </w:r>
@@ -1153,10 +1318,14 @@
         <w:rPr>
           <w:b/>
           <w:bCs/>
+          <w:highlight w:val="black"/>
         </w:rPr>
         <w:t xml:space="preserve">: </w:t>
       </w:r>
       <w:r>
+        <w:rPr>
+          <w:highlight w:val="black"/>
+        </w:rPr>
         <w:t xml:space="preserve">linguaggio tipizzato che estende JavaScript con un sistema di tipi statici. </w:t>
       </w:r>
     </w:p>
@@ -1166,24 +1335,36 @@
           <w:ilvl w:val="0"/>
           <w:numId w:val="2"/>
         </w:numPr>
-        <w:jc w:val="both"/>
+        <w:rPr>
+          <w:highlight w:val="black"/>
+        </w:rPr>
       </w:pPr>
       <w:r>
         <w:rPr>
           <w:b/>
           <w:bCs/>
+          <w:highlight w:val="black"/>
         </w:rPr>
         <w:t xml:space="preserve">SCSS: </w:t>
       </w:r>
       <w:r>
+        <w:rPr>
+          <w:highlight w:val="black"/>
+        </w:rPr>
         <w:t xml:space="preserve">preprocessore CSS che aggiunge al linguaggio di stile funzionalità avanzate come variabili, </w:t>
       </w:r>
       <w:proofErr w:type="spellStart"/>
       <w:r>
+        <w:rPr>
+          <w:highlight w:val="black"/>
+        </w:rPr>
         <w:t>mixin</w:t>
       </w:r>
       <w:proofErr w:type="spellEnd"/>
       <w:r>
+        <w:rPr>
+          <w:highlight w:val="black"/>
+        </w:rPr>
         <w:t xml:space="preserve">, nesting e funzioni. </w:t>
       </w:r>
     </w:p>
@@ -1193,184 +1374,413 @@
           <w:ilvl w:val="0"/>
           <w:numId w:val="2"/>
         </w:numPr>
-        <w:jc w:val="both"/>
+        <w:rPr>
+          <w:highlight w:val="black"/>
+        </w:rPr>
       </w:pPr>
       <w:r>
         <w:rPr>
           <w:b/>
           <w:bCs/>
+          <w:highlight w:val="black"/>
         </w:rPr>
         <w:t xml:space="preserve">Bootstrap 5: </w:t>
       </w:r>
       <w:r>
+        <w:rPr>
+          <w:highlight w:val="black"/>
+        </w:rPr>
         <w:t>framework CSS per la gestione del layout responsive tramite sistema a griglia. Fornisce componenti UI predefiniti che accelerano lo sviluppo dell'interfaccia.</w:t>
       </w:r>
     </w:p>
     <w:p>
       <w:pPr>
-        <w:pStyle w:val="Heading4"/>
+        <w:rPr>
+          <w:highlight w:val="yellow"/>
+        </w:rPr>
+      </w:pPr>
+      <w:r>
+        <w:rPr>
+          <w:highlight w:val="yellow"/>
+        </w:rPr>
+        <w:t xml:space="preserve">Per rendere la SPA responsive è stato adottato come toolkit di strumenti, Bootstrap 5. </w:t>
+      </w:r>
+    </w:p>
+    <w:p>
+      <w:pPr>
+        <w:pStyle w:val="Titolo4"/>
       </w:pPr>
       <w:r>
         <w:t>Progressive Web App (PWA)</w:t>
       </w:r>
     </w:p>
     <w:p>
-      <w:pPr>
-        <w:jc w:val="both"/>
-      </w:pPr>
+      <w:r>
+        <w:rPr>
+          <w:highlight w:val="yellow"/>
+        </w:rPr>
+        <w:t>Per rendere l’applicazione fruibile facilmente anche da mobile,</w:t>
+      </w:r>
+      <w:r>
+        <w:t xml:space="preserve"> </w:t>
+      </w:r>
+      <w:r>
+        <w:t xml:space="preserve">è </w:t>
+      </w:r>
+      <w:r>
+        <w:t>previsto un</w:t>
+      </w:r>
+      <w:r>
+        <w:t xml:space="preserve"> supporto alla</w:t>
+      </w:r>
+      <w:r>
+        <w:t xml:space="preserve"> Progressive Web App tramite il pacchetto @angular/pwa. </w:t>
+      </w:r>
+      <w:r>
+        <w:rPr>
+          <w:highlight w:val="black"/>
+        </w:rPr>
+        <w:t xml:space="preserve">Le PWA sono applicazioni web che, grazie all'utilizzo di Service Worker e di un file </w:t>
+      </w:r>
+      <w:proofErr w:type="spellStart"/>
+      <w:r>
+        <w:rPr>
+          <w:highlight w:val="black"/>
+        </w:rPr>
+        <w:t>manifest</w:t>
+      </w:r>
+      <w:proofErr w:type="spellEnd"/>
+      <w:r>
+        <w:rPr>
+          <w:highlight w:val="black"/>
+        </w:rPr>
+        <w:t>, acquisiscono caratteristiche tipiche delle app native: possono essere installate sul dispositivo dell'utente, funzionano anche in condizioni di connettività ridotta e si avviano con una splash screen personalizzata.</w:t>
+      </w:r>
+    </w:p>
+    <w:p>
+      <w:pPr>
+        <w:pStyle w:val="Titolo2"/>
+      </w:pPr>
+      <w:r>
+        <w:t>Sicurezza</w:t>
+      </w:r>
+    </w:p>
+    <w:p>
+      <w:r>
+        <w:t xml:space="preserve">La sicurezza dell'applicazione è gestita </w:t>
+      </w:r>
+      <w:r>
+        <w:rPr>
+          <w:highlight w:val="black"/>
+        </w:rPr>
+        <w:t>a più livelli,</w:t>
+      </w:r>
+      <w:r>
+        <w:t xml:space="preserve"> sia </w:t>
+      </w:r>
+      <w:r>
+        <w:rPr>
+          <w:highlight w:val="black"/>
+        </w:rPr>
+        <w:t>sul</w:t>
+      </w:r>
+      <w:r>
+        <w:t xml:space="preserve"> </w:t>
+      </w:r>
+      <w:r>
+        <w:rPr>
+          <w:highlight w:val="yellow"/>
+        </w:rPr>
+        <w:t>lato</w:t>
+      </w:r>
+      <w:r>
+        <w:t xml:space="preserve"> </w:t>
+      </w:r>
+      <w:proofErr w:type="spellStart"/>
+      <w:r>
+        <w:t>frontend</w:t>
+      </w:r>
+      <w:proofErr w:type="spellEnd"/>
+      <w:r>
+        <w:t xml:space="preserve"> che </w:t>
+      </w:r>
+      <w:r>
+        <w:rPr>
+          <w:highlight w:val="black"/>
+        </w:rPr>
+        <w:t>sul</w:t>
+      </w:r>
+      <w:r>
+        <w:t xml:space="preserve"> </w:t>
+      </w:r>
+      <w:proofErr w:type="spellStart"/>
+      <w:r>
+        <w:t>backend</w:t>
+      </w:r>
+      <w:proofErr w:type="spellEnd"/>
+      <w:r>
+        <w:t>.</w:t>
+      </w:r>
+    </w:p>
+    <w:p>
+      <w:pPr>
+        <w:pStyle w:val="Titolo4"/>
+      </w:pPr>
+      <w:r>
+        <w:t>Autenticazione JWT</w:t>
+      </w:r>
+    </w:p>
+    <w:p>
+      <w:r>
+        <w:t xml:space="preserve">L'accesso alle funzionalità protette della piattaforma è regolato da un sistema di autenticazione basato su JWT (JSON Web Token). </w:t>
+      </w:r>
+      <w:r>
+        <w:rPr>
+          <w:highlight w:val="black"/>
+        </w:rPr>
+        <w:t xml:space="preserve">Al momento del login, il </w:t>
+      </w:r>
+      <w:proofErr w:type="spellStart"/>
+      <w:r>
+        <w:rPr>
+          <w:highlight w:val="black"/>
+        </w:rPr>
+        <w:t>backend</w:t>
+      </w:r>
+      <w:proofErr w:type="spellEnd"/>
+      <w:r>
+        <w:rPr>
+          <w:highlight w:val="black"/>
+        </w:rPr>
+        <w:t xml:space="preserve"> genera un token firmato con una chiave segreta che contiene le informazioni sull'identità dell'utente e il suo ruolo. Questo token viene incluso in tutte le successive richieste HTTP nell'</w:t>
+      </w:r>
+      <w:proofErr w:type="spellStart"/>
+      <w:r>
+        <w:rPr>
+          <w:highlight w:val="black"/>
+        </w:rPr>
+        <w:t>header</w:t>
+      </w:r>
+      <w:proofErr w:type="spellEnd"/>
+      <w:r>
+        <w:rPr>
+          <w:highlight w:val="black"/>
+        </w:rPr>
+        <w:t xml:space="preserve"> </w:t>
+      </w:r>
+      <w:proofErr w:type="spellStart"/>
+      <w:r>
+        <w:rPr>
+          <w:highlight w:val="black"/>
+        </w:rPr>
+        <w:t>Authorization</w:t>
+      </w:r>
+      <w:proofErr w:type="spellEnd"/>
+      <w:r>
+        <w:rPr>
+          <w:highlight w:val="black"/>
+        </w:rPr>
+        <w:t xml:space="preserve">, consentendo al </w:t>
+      </w:r>
+      <w:proofErr w:type="spellStart"/>
+      <w:r>
+        <w:rPr>
+          <w:highlight w:val="black"/>
+        </w:rPr>
+        <w:t>backend</w:t>
+      </w:r>
+      <w:proofErr w:type="spellEnd"/>
+      <w:r>
+        <w:rPr>
+          <w:highlight w:val="black"/>
+        </w:rPr>
+        <w:t xml:space="preserve"> di verificare l'identità del chiamante senza mantenere uno stato di sessione lato server.</w:t>
+      </w:r>
+    </w:p>
+    <w:p>
+      <w:r>
+        <w:rPr>
+          <w:highlight w:val="yellow"/>
+        </w:rPr>
+        <w:t>In caso di accesso a funzionalità protette, sprovvisti di autenticazione, verrà restituita una risposta con codice HTTP 401 (</w:t>
+      </w:r>
+      <w:proofErr w:type="spellStart"/>
+      <w:r>
+        <w:rPr>
+          <w:highlight w:val="yellow"/>
+        </w:rPr>
+        <w:t>Unauthorized</w:t>
+      </w:r>
+      <w:proofErr w:type="spellEnd"/>
+      <w:r>
+        <w:rPr>
+          <w:highlight w:val="yellow"/>
+        </w:rPr>
+        <w:t>).</w:t>
+      </w:r>
+    </w:p>
+    <w:p>
+      <w:r>
+        <w:rPr>
+          <w:highlight w:val="black"/>
+        </w:rPr>
+        <w:t xml:space="preserve">-il ruolo è presente come </w:t>
+      </w:r>
+      <w:proofErr w:type="spellStart"/>
+      <w:r>
+        <w:rPr>
+          <w:highlight w:val="black"/>
+        </w:rPr>
+        <w:t>claim</w:t>
+      </w:r>
+      <w:proofErr w:type="spellEnd"/>
+      <w:r>
+        <w:rPr>
+          <w:highlight w:val="black"/>
+        </w:rPr>
+        <w:t xml:space="preserve"> aggiunta da noi</w:t>
+      </w:r>
+      <w:r>
+        <w:t xml:space="preserve"> </w:t>
+      </w:r>
+    </w:p>
+    <w:p>
+      <w:pPr>
+        <w:pStyle w:val="Titolo4"/>
+      </w:pPr>
+      <w:r>
+        <w:lastRenderedPageBreak/>
+        <w:t>Autorizzazione Basata sui Ruoli</w:t>
+      </w:r>
+    </w:p>
+    <w:p>
       <w:r>
         <w:t xml:space="preserve">Il </w:t>
       </w:r>
       <w:proofErr w:type="spellStart"/>
       <w:r>
-        <w:t>frontend</w:t>
-      </w:r>
-      <w:proofErr w:type="spellEnd"/>
-      <w:r>
-        <w:t xml:space="preserve"> è configurato </w:t>
-      </w:r>
-      <w:r>
-        <w:t>con supporto alla</w:t>
-      </w:r>
-      <w:r>
-        <w:t xml:space="preserve"> Progressive Web App tramite il pacchetto @angular/pwa. Le PWA sono applicazioni web che, grazie all'utilizzo di Service Worker e di un file </w:t>
-      </w:r>
-      <w:proofErr w:type="spellStart"/>
-      <w:r>
-        <w:t>manifest</w:t>
-      </w:r>
-      <w:proofErr w:type="spellEnd"/>
-      <w:r>
-        <w:t>, acquisiscono caratteristiche tipiche delle app native: possono essere installate sul dispositivo dell'utente, funzionano anche in condizioni di connettività ridotta e si avviano con una splash screen personalizzata.</w:t>
-      </w:r>
-    </w:p>
-    <w:p>
-      <w:pPr>
-        <w:pStyle w:val="Heading2"/>
-      </w:pPr>
-      <w:r>
-        <w:t>Sicurezza</w:t>
-      </w:r>
-    </w:p>
-    <w:p>
-      <w:r>
-        <w:t xml:space="preserve">La sicurezza dell'applicazione è gestita a più livelli, sia sul </w:t>
-      </w:r>
-      <w:proofErr w:type="spellStart"/>
-      <w:r>
-        <w:t>frontend</w:t>
-      </w:r>
-      <w:proofErr w:type="spellEnd"/>
-      <w:r>
-        <w:t xml:space="preserve"> che sul </w:t>
-      </w:r>
-      <w:proofErr w:type="spellStart"/>
-      <w:r>
         <w:t>backend</w:t>
       </w:r>
       <w:proofErr w:type="spellEnd"/>
       <w:r>
+        <w:t xml:space="preserve"> implementa un sistema di controllo degli accessi basato sui ruoli (RBAC — Role-</w:t>
+      </w:r>
+      <w:proofErr w:type="spellStart"/>
+      <w:r>
+        <w:t>Based</w:t>
+      </w:r>
+      <w:proofErr w:type="spellEnd"/>
+      <w:r>
+        <w:t xml:space="preserve"> Access Control).</w:t>
+      </w:r>
+    </w:p>
+    <w:p>
+      <w:r>
+        <w:rPr>
+          <w:highlight w:val="yellow"/>
+        </w:rPr>
+        <w:t xml:space="preserve">Nello specifico il </w:t>
+      </w:r>
+      <w:r>
+        <w:rPr>
+          <w:color w:val="000000" w:themeColor="text1"/>
+          <w:highlight w:val="yellow"/>
+        </w:rPr>
+        <w:t xml:space="preserve">ruolo </w:t>
+      </w:r>
+      <w:r>
+        <w:rPr>
+          <w:color w:val="000000" w:themeColor="text1"/>
+          <w:highlight w:val="yellow"/>
+        </w:rPr>
+        <w:t xml:space="preserve">sarà conservato all’interno dei </w:t>
+      </w:r>
+      <w:proofErr w:type="spellStart"/>
+      <w:r>
+        <w:rPr>
+          <w:color w:val="000000" w:themeColor="text1"/>
+          <w:highlight w:val="yellow"/>
+        </w:rPr>
+        <w:t>claims</w:t>
+      </w:r>
+      <w:proofErr w:type="spellEnd"/>
+      <w:r>
+        <w:rPr>
+          <w:color w:val="000000" w:themeColor="text1"/>
+          <w:highlight w:val="yellow"/>
+        </w:rPr>
+        <w:t xml:space="preserve"> del token JWT, </w:t>
+      </w:r>
+      <w:r>
+        <w:rPr>
+          <w:color w:val="000000" w:themeColor="text1"/>
+          <w:highlight w:val="yellow"/>
+        </w:rPr>
+        <w:t xml:space="preserve">cosicché ogni </w:t>
+      </w:r>
+      <w:r>
+        <w:rPr>
+          <w:highlight w:val="yellow"/>
+        </w:rPr>
+        <w:t xml:space="preserve">endpoint dell'API REST </w:t>
+      </w:r>
+      <w:r>
+        <w:rPr>
+          <w:highlight w:val="yellow"/>
+        </w:rPr>
+        <w:t>possa essere</w:t>
+      </w:r>
+      <w:r>
+        <w:rPr>
+          <w:highlight w:val="yellow"/>
+        </w:rPr>
+        <w:t xml:space="preserve"> protetto da </w:t>
+      </w:r>
+      <w:r>
+        <w:rPr>
+          <w:highlight w:val="yellow"/>
+        </w:rPr>
+        <w:t xml:space="preserve">specifiche </w:t>
+      </w:r>
+      <w:r>
+        <w:rPr>
+          <w:highlight w:val="yellow"/>
+        </w:rPr>
+        <w:t xml:space="preserve">annotazioni Spring Security che </w:t>
+      </w:r>
+      <w:r>
+        <w:rPr>
+          <w:highlight w:val="yellow"/>
+        </w:rPr>
+        <w:t>ne gestiscano</w:t>
+      </w:r>
+      <w:r>
+        <w:rPr>
+          <w:highlight w:val="yellow"/>
+        </w:rPr>
+        <w:t xml:space="preserve"> l’autorizzazione</w:t>
+      </w:r>
+      <w:r>
+        <w:rPr>
+          <w:highlight w:val="yellow"/>
+        </w:rPr>
+        <w:t xml:space="preserve"> ad accedervi</w:t>
+      </w:r>
+      <w:r>
+        <w:rPr>
+          <w:highlight w:val="yellow"/>
+        </w:rPr>
         <w:t>.</w:t>
       </w:r>
-    </w:p>
-    <w:p>
-      <w:pPr>
-        <w:pStyle w:val="Heading4"/>
-      </w:pPr>
-      <w:r>
-        <w:lastRenderedPageBreak/>
-        <w:t>Autenticazione JWT</w:t>
-      </w:r>
-    </w:p>
-    <w:p>
-      <w:r>
-        <w:t xml:space="preserve">L'accesso alle funzionalità protette della piattaforma è regolato da un sistema di autenticazione basato su JWT (JSON Web Token). Al momento del login, il </w:t>
-      </w:r>
-      <w:proofErr w:type="spellStart"/>
-      <w:r>
-        <w:t>backend</w:t>
-      </w:r>
-      <w:proofErr w:type="spellEnd"/>
-      <w:r>
-        <w:t xml:space="preserve"> genera un token firmato con una chiave segreta che contiene le informazioni sull'identità dell'utente e il suo ruolo. Questo token viene incluso in tutte le successive richieste HTTP nell'</w:t>
-      </w:r>
-      <w:proofErr w:type="spellStart"/>
-      <w:r>
-        <w:t>header</w:t>
-      </w:r>
-      <w:proofErr w:type="spellEnd"/>
       <w:r>
         <w:t xml:space="preserve"> </w:t>
       </w:r>
-      <w:proofErr w:type="spellStart"/>
-      <w:r>
-        <w:t>Authorization</w:t>
-      </w:r>
-      <w:proofErr w:type="spellEnd"/>
-      <w:r>
-        <w:t xml:space="preserve">, consentendo al </w:t>
-      </w:r>
-      <w:proofErr w:type="spellStart"/>
-      <w:r>
-        <w:t>backend</w:t>
-      </w:r>
-      <w:proofErr w:type="spellEnd"/>
-      <w:r>
-        <w:t xml:space="preserve"> di verificare l'identità del chiamante senza mantenere uno stato di sessione lato server.</w:t>
-      </w:r>
-    </w:p>
-    <w:p>
-      <w:r>
-        <w:rPr>
-          <w:highlight w:val="yellow"/>
-        </w:rPr>
-        <w:t xml:space="preserve">-il ruolo è presente come </w:t>
-      </w:r>
-      <w:proofErr w:type="spellStart"/>
-      <w:r>
-        <w:rPr>
-          <w:highlight w:val="yellow"/>
-        </w:rPr>
-        <w:t>claim</w:t>
-      </w:r>
-      <w:proofErr w:type="spellEnd"/>
-      <w:r>
-        <w:rPr>
-          <w:highlight w:val="yellow"/>
-        </w:rPr>
-        <w:t xml:space="preserve"> aggiunta da noi</w:t>
-      </w:r>
-      <w:r>
-        <w:t xml:space="preserve"> </w:t>
-      </w:r>
-    </w:p>
-    <w:p>
-      <w:pPr>
-        <w:pStyle w:val="Heading4"/>
-      </w:pPr>
-      <w:r>
-        <w:t>Autorizzazione Basata sui Ruoli</w:t>
-      </w:r>
-    </w:p>
-    <w:p>
-      <w:r>
-        <w:t xml:space="preserve">Il </w:t>
-      </w:r>
-      <w:proofErr w:type="spellStart"/>
-      <w:r>
-        <w:t>backend</w:t>
-      </w:r>
-      <w:proofErr w:type="spellEnd"/>
-      <w:r>
-        <w:t xml:space="preserve"> implementa un sistema di controllo degli accessi basato sui ruoli (RBAC — Role-</w:t>
-      </w:r>
-      <w:proofErr w:type="spellStart"/>
-      <w:r>
-        <w:t>Based</w:t>
-      </w:r>
-      <w:proofErr w:type="spellEnd"/>
-      <w:r>
-        <w:t xml:space="preserve"> Access Control). Ogni endpoint dell'API REST è protetto da annotazioni Spring Security che definiscono i ruoli autorizzati ad accedervi. I ruoli definiti nel sistema sono:</w:t>
+      <w:r>
+        <w:rPr>
+          <w:color w:val="000000" w:themeColor="text1"/>
+          <w:highlight w:val="black"/>
+        </w:rPr>
+        <w:t>. I ruoli definiti nel sistema sono:</w:t>
       </w:r>
     </w:p>
     <w:p>
@@ -1379,17 +1789,17 @@
           <w:ilvl w:val="0"/>
           <w:numId w:val="2"/>
         </w:numPr>
-      </w:pPr>
-      <w:r>
-        <w:t xml:space="preserve">USER: utente registrato, con accesso alle funzionalità base di gestione </w:t>
-      </w:r>
-      <w:proofErr w:type="gramStart"/>
-      <w:r>
-        <w:t>del team</w:t>
-      </w:r>
-      <w:proofErr w:type="gramEnd"/>
-      <w:r>
-        <w:t xml:space="preserve"> e partecipazione agli hackathon.</w:t>
+        <w:rPr>
+          <w:color w:val="000000" w:themeColor="text1"/>
+          <w:highlight w:val="black"/>
+        </w:rPr>
+      </w:pPr>
+      <w:r>
+        <w:rPr>
+          <w:color w:val="000000" w:themeColor="text1"/>
+          <w:highlight w:val="black"/>
+        </w:rPr>
+        <w:t>USER: utente registrato, con accesso alle funzionalità base di gestione del team e partecipazione agli hackathon.</w:t>
       </w:r>
     </w:p>
     <w:p>
@@ -1398,8 +1808,16 @@
           <w:ilvl w:val="0"/>
           <w:numId w:val="2"/>
         </w:numPr>
-      </w:pPr>
-      <w:r>
+        <w:rPr>
+          <w:color w:val="000000" w:themeColor="text1"/>
+          <w:highlight w:val="black"/>
+        </w:rPr>
+      </w:pPr>
+      <w:r>
+        <w:rPr>
+          <w:color w:val="000000" w:themeColor="text1"/>
+          <w:highlight w:val="black"/>
+        </w:rPr>
         <w:t>STAFF: membro dello staff con accesso alle funzionalità di gestione degli hackathon cui è assegnato.</w:t>
       </w:r>
     </w:p>
@@ -1409,23 +1827,101 @@
           <w:ilvl w:val="0"/>
           <w:numId w:val="2"/>
         </w:numPr>
-      </w:pPr>
-      <w:r>
+        <w:rPr>
+          <w:color w:val="000000" w:themeColor="text1"/>
+          <w:highlight w:val="black"/>
+        </w:rPr>
+      </w:pPr>
+      <w:r>
+        <w:rPr>
+          <w:color w:val="000000" w:themeColor="text1"/>
+          <w:highlight w:val="black"/>
+        </w:rPr>
         <w:t>ADMIN: amministratore di sistema con accesso completo a tutte le funzionalità della piattaforma.</w:t>
       </w:r>
     </w:p>
     <w:p>
       <w:pPr>
-        <w:pStyle w:val="Heading4"/>
-      </w:pPr>
-      <w:r>
-        <w:t xml:space="preserve">Protezione Lato </w:t>
-      </w:r>
-      <w:proofErr w:type="spellStart"/>
-      <w:r>
-        <w:t>Frontend</w:t>
-      </w:r>
-      <w:proofErr w:type="spellEnd"/>
+        <w:rPr>
+          <w:highlight w:val="yellow"/>
+        </w:rPr>
+      </w:pPr>
+      <w:r>
+        <w:rPr>
+          <w:color w:val="000000" w:themeColor="text1"/>
+          <w:highlight w:val="yellow"/>
+        </w:rPr>
+        <w:t>In</w:t>
+      </w:r>
+      <w:r>
+        <w:rPr>
+          <w:color w:val="000000" w:themeColor="text1"/>
+          <w:highlight w:val="yellow"/>
+        </w:rPr>
+        <w:t xml:space="preserve"> caso di accesso non autorizzato, la risposta avrà come codice HTTP </w:t>
+      </w:r>
+      <w:r>
+        <w:rPr>
+          <w:color w:val="000000" w:themeColor="text1"/>
+          <w:highlight w:val="yellow"/>
+        </w:rPr>
+        <w:t xml:space="preserve">403 </w:t>
+      </w:r>
+      <w:r>
+        <w:rPr>
+          <w:highlight w:val="yellow"/>
+        </w:rPr>
+        <w:t>(</w:t>
+      </w:r>
+      <w:proofErr w:type="spellStart"/>
+      <w:r>
+        <w:rPr>
+          <w:highlight w:val="yellow"/>
+        </w:rPr>
+        <w:t>Forbidden</w:t>
+      </w:r>
+      <w:proofErr w:type="spellEnd"/>
+      <w:r>
+        <w:rPr>
+          <w:highlight w:val="yellow"/>
+        </w:rPr>
+        <w:t>).</w:t>
+      </w:r>
+    </w:p>
+    <w:p>
+      <w:pPr>
+        <w:pStyle w:val="Titolo4"/>
+      </w:pPr>
+      <w:r>
+        <w:t>Cors</w:t>
+      </w:r>
+    </w:p>
+    <w:p>
+      <w:pPr>
+        <w:pStyle w:val="Titolo4"/>
+      </w:pPr>
+      <w:r>
+        <w:t>Crittografia</w:t>
+      </w:r>
+      <w:r>
+        <w:t xml:space="preserve"> password</w:t>
+      </w:r>
+    </w:p>
+    <w:p>
+      <w:pPr>
+        <w:pStyle w:val="Titolo4"/>
+      </w:pPr>
+      <w:r>
+        <w:t>ORM (prevenzione SQL injection)?</w:t>
+      </w:r>
+    </w:p>
+    <w:p>
+      <w:pPr>
+        <w:pStyle w:val="Titolo4"/>
+      </w:pPr>
+      <w:r>
+        <w:t>Guard</w:t>
+      </w:r>
     </w:p>
     <w:p>
       <w:r>
@@ -1461,37 +1957,61 @@
       </w:r>
       <w:proofErr w:type="spellEnd"/>
       <w:r>
-        <w:t xml:space="preserve"> che impediscono la navigazione verso pagine riservate a utenti non autenticati o con ruoli insufficienti. Anche se questa protezione è bypassabile lato client, la vera sicurezza è garantita dal </w:t>
-      </w:r>
-      <w:proofErr w:type="spellStart"/>
-      <w:r>
+        <w:t xml:space="preserve"> che impediscono la navigazione verso pagine riservate a utenti non autenticati o con ruoli insufficienti. </w:t>
+      </w:r>
+      <w:r>
+        <w:rPr>
+          <w:highlight w:val="black"/>
+        </w:rPr>
+        <w:t xml:space="preserve">Anche se questa protezione è bypassabile lato client, la vera sicurezza è garantita dal </w:t>
+      </w:r>
+      <w:proofErr w:type="spellStart"/>
+      <w:r>
+        <w:rPr>
+          <w:highlight w:val="black"/>
+        </w:rPr>
         <w:t>backend</w:t>
       </w:r>
       <w:proofErr w:type="spellEnd"/>
       <w:r>
+        <w:rPr>
+          <w:highlight w:val="black"/>
+        </w:rPr>
         <w:t xml:space="preserve"> che rifiuta qualsiasi richiesta priva di un token valido o con permessi insufficienti, restituendo un codice HTTP 401 (</w:t>
       </w:r>
       <w:proofErr w:type="spellStart"/>
       <w:r>
+        <w:rPr>
+          <w:highlight w:val="black"/>
+        </w:rPr>
         <w:t>Unauthorized</w:t>
       </w:r>
       <w:proofErr w:type="spellEnd"/>
       <w:r>
+        <w:rPr>
+          <w:highlight w:val="black"/>
+        </w:rPr>
         <w:t>) o 403 (</w:t>
       </w:r>
       <w:proofErr w:type="spellStart"/>
       <w:r>
+        <w:rPr>
+          <w:highlight w:val="black"/>
+        </w:rPr>
         <w:t>Forbidden</w:t>
       </w:r>
       <w:proofErr w:type="spellEnd"/>
       <w:r>
+        <w:rPr>
+          <w:highlight w:val="black"/>
+        </w:rPr>
         <w:t>).</w:t>
       </w:r>
     </w:p>
     <w:p/>
     <w:p>
       <w:pPr>
-        <w:pStyle w:val="ListParagraph"/>
+        <w:pStyle w:val="Paragrafoelenco"/>
       </w:pPr>
     </w:p>
     <w:sectPr>
@@ -2333,18 +2853,25 @@
     <w:lsdException w:name="Unresolved Mention" w:semiHidden="1" w:unhideWhenUsed="1"/>
     <w:lsdException w:name="Smart Link" w:semiHidden="1" w:unhideWhenUsed="1"/>
   </w:latentStyles>
-  <w:style w:type="paragraph" w:default="1" w:styleId="Normal">
+  <w:style w:type="paragraph" w:default="1" w:styleId="Normale">
     <w:name w:val="Normal"/>
     <w:qFormat/>
+    <w:rsid w:val="007670B5"/>
+    <w:pPr>
+      <w:jc w:val="both"/>
+    </w:pPr>
+    <w:rPr>
+      <w:sz w:val="22"/>
+    </w:rPr>
   </w:style>
-  <w:style w:type="paragraph" w:styleId="Heading1">
+  <w:style w:type="paragraph" w:styleId="Titolo1">
     <w:name w:val="heading 1"/>
-    <w:basedOn w:val="Normal"/>
-    <w:next w:val="Normal"/>
-    <w:link w:val="Heading1Char"/>
+    <w:basedOn w:val="Normale"/>
+    <w:next w:val="Normale"/>
+    <w:link w:val="Titolo1Carattere"/>
     <w:uiPriority w:val="9"/>
     <w:qFormat/>
-    <w:rsid w:val="00697981"/>
+    <w:rsid w:val="00706E00"/>
     <w:pPr>
       <w:keepNext/>
       <w:keepLines/>
@@ -2352,21 +2879,22 @@
       <w:outlineLvl w:val="0"/>
     </w:pPr>
     <w:rPr>
-      <w:rFonts w:asciiTheme="majorHAnsi" w:eastAsiaTheme="majorEastAsia" w:hAnsiTheme="majorHAnsi" w:cstheme="majorBidi"/>
-      <w:color w:val="0F4761" w:themeColor="accent1" w:themeShade="BF"/>
+      <w:rFonts w:ascii="Segoe UI" w:eastAsiaTheme="majorEastAsia" w:hAnsi="Segoe UI" w:cstheme="majorBidi"/>
+      <w:b/>
+      <w:color w:val="196B24" w:themeColor="accent3"/>
       <w:sz w:val="40"/>
       <w:szCs w:val="40"/>
     </w:rPr>
   </w:style>
-  <w:style w:type="paragraph" w:styleId="Heading2">
+  <w:style w:type="paragraph" w:styleId="Titolo2">
     <w:name w:val="heading 2"/>
-    <w:basedOn w:val="Normal"/>
-    <w:next w:val="Normal"/>
-    <w:link w:val="Heading2Char"/>
+    <w:basedOn w:val="Normale"/>
+    <w:next w:val="Normale"/>
+    <w:link w:val="Titolo2Carattere"/>
     <w:uiPriority w:val="9"/>
     <w:unhideWhenUsed/>
     <w:qFormat/>
-    <w:rsid w:val="00697981"/>
+    <w:rsid w:val="00706E00"/>
     <w:pPr>
       <w:keepNext/>
       <w:keepLines/>
@@ -2375,16 +2903,16 @@
     </w:pPr>
     <w:rPr>
       <w:rFonts w:asciiTheme="majorHAnsi" w:eastAsiaTheme="majorEastAsia" w:hAnsiTheme="majorHAnsi" w:cstheme="majorBidi"/>
-      <w:color w:val="0F4761" w:themeColor="accent1" w:themeShade="BF"/>
+      <w:color w:val="47D459" w:themeColor="accent3" w:themeTint="99"/>
       <w:sz w:val="32"/>
       <w:szCs w:val="32"/>
     </w:rPr>
   </w:style>
-  <w:style w:type="paragraph" w:styleId="Heading3">
+  <w:style w:type="paragraph" w:styleId="Titolo3">
     <w:name w:val="heading 3"/>
-    <w:basedOn w:val="Normal"/>
-    <w:next w:val="Normal"/>
-    <w:link w:val="Heading3Char"/>
+    <w:basedOn w:val="Normale"/>
+    <w:next w:val="Normale"/>
+    <w:link w:val="Titolo3Carattere"/>
     <w:uiPriority w:val="9"/>
     <w:unhideWhenUsed/>
     <w:qFormat/>
@@ -2402,11 +2930,11 @@
       <w:szCs w:val="28"/>
     </w:rPr>
   </w:style>
-  <w:style w:type="paragraph" w:styleId="Heading4">
+  <w:style w:type="paragraph" w:styleId="Titolo4">
     <w:name w:val="heading 4"/>
-    <w:basedOn w:val="Normal"/>
-    <w:next w:val="Normal"/>
-    <w:link w:val="Heading4Char"/>
+    <w:basedOn w:val="Normale"/>
+    <w:next w:val="Normale"/>
+    <w:link w:val="Titolo4Carattere"/>
     <w:uiPriority w:val="9"/>
     <w:unhideWhenUsed/>
     <w:qFormat/>
@@ -2424,16 +2952,15 @@
       <w:color w:val="0F4761" w:themeColor="accent1" w:themeShade="BF"/>
     </w:rPr>
   </w:style>
-  <w:style w:type="paragraph" w:styleId="Heading5">
+  <w:style w:type="paragraph" w:styleId="Titolo5">
     <w:name w:val="heading 5"/>
-    <w:basedOn w:val="Normal"/>
-    <w:next w:val="Normal"/>
-    <w:link w:val="Heading5Char"/>
+    <w:basedOn w:val="Normale"/>
+    <w:next w:val="Normale"/>
+    <w:link w:val="Titolo5Carattere"/>
     <w:uiPriority w:val="9"/>
-    <w:semiHidden/>
     <w:unhideWhenUsed/>
     <w:qFormat/>
-    <w:rsid w:val="00697981"/>
+    <w:rsid w:val="008E3F50"/>
     <w:pPr>
       <w:keepNext/>
       <w:keepLines/>
@@ -2443,15 +2970,15 @@
     <w:rPr>
       <w:rFonts w:eastAsiaTheme="majorEastAsia" w:cstheme="majorBidi"/>
       <w:color w:val="0F4761" w:themeColor="accent1" w:themeShade="BF"/>
+      <w:u w:val="single"/>
     </w:rPr>
   </w:style>
-  <w:style w:type="paragraph" w:styleId="Heading6">
+  <w:style w:type="paragraph" w:styleId="Titolo6">
     <w:name w:val="heading 6"/>
-    <w:basedOn w:val="Normal"/>
-    <w:next w:val="Normal"/>
-    <w:link w:val="Heading6Char"/>
+    <w:basedOn w:val="Normale"/>
+    <w:next w:val="Normale"/>
+    <w:link w:val="Titolo6Carattere"/>
     <w:uiPriority w:val="9"/>
-    <w:semiHidden/>
     <w:unhideWhenUsed/>
     <w:qFormat/>
     <w:rsid w:val="00697981"/>
@@ -2468,11 +2995,11 @@
       <w:color w:val="595959" w:themeColor="text1" w:themeTint="A6"/>
     </w:rPr>
   </w:style>
-  <w:style w:type="paragraph" w:styleId="Heading7">
+  <w:style w:type="paragraph" w:styleId="Titolo7">
     <w:name w:val="heading 7"/>
-    <w:basedOn w:val="Normal"/>
-    <w:next w:val="Normal"/>
-    <w:link w:val="Heading7Char"/>
+    <w:basedOn w:val="Normale"/>
+    <w:next w:val="Normale"/>
+    <w:link w:val="Titolo7Carattere"/>
     <w:uiPriority w:val="9"/>
     <w:semiHidden/>
     <w:unhideWhenUsed/>
@@ -2489,11 +3016,11 @@
       <w:color w:val="595959" w:themeColor="text1" w:themeTint="A6"/>
     </w:rPr>
   </w:style>
-  <w:style w:type="paragraph" w:styleId="Heading8">
+  <w:style w:type="paragraph" w:styleId="Titolo8">
     <w:name w:val="heading 8"/>
-    <w:basedOn w:val="Normal"/>
-    <w:next w:val="Normal"/>
-    <w:link w:val="Heading8Char"/>
+    <w:basedOn w:val="Normale"/>
+    <w:next w:val="Normale"/>
+    <w:link w:val="Titolo8Carattere"/>
     <w:uiPriority w:val="9"/>
     <w:semiHidden/>
     <w:unhideWhenUsed/>
@@ -2512,11 +3039,11 @@
       <w:color w:val="272727" w:themeColor="text1" w:themeTint="D8"/>
     </w:rPr>
   </w:style>
-  <w:style w:type="paragraph" w:styleId="Heading9">
+  <w:style w:type="paragraph" w:styleId="Titolo9">
     <w:name w:val="heading 9"/>
-    <w:basedOn w:val="Normal"/>
-    <w:next w:val="Normal"/>
-    <w:link w:val="Heading9Char"/>
+    <w:basedOn w:val="Normale"/>
+    <w:next w:val="Normale"/>
+    <w:link w:val="Titolo9Carattere"/>
     <w:uiPriority w:val="9"/>
     <w:semiHidden/>
     <w:unhideWhenUsed/>
@@ -2533,12 +3060,13 @@
       <w:color w:val="272727" w:themeColor="text1" w:themeTint="D8"/>
     </w:rPr>
   </w:style>
-  <w:style w:type="character" w:default="1" w:styleId="DefaultParagraphFont">
+  <w:style w:type="character" w:default="1" w:styleId="Carpredefinitoparagrafo">
     <w:name w:val="Default Paragraph Font"/>
     <w:uiPriority w:val="1"/>
+    <w:semiHidden/>
     <w:unhideWhenUsed/>
   </w:style>
-  <w:style w:type="table" w:default="1" w:styleId="TableNormal">
+  <w:style w:type="table" w:default="1" w:styleId="Tabellanormale">
     <w:name w:val="Normal Table"/>
     <w:uiPriority w:val="99"/>
     <w:semiHidden/>
@@ -2553,42 +3081,43 @@
       </w:tblCellMar>
     </w:tblPr>
   </w:style>
-  <w:style w:type="numbering" w:default="1" w:styleId="NoList">
+  <w:style w:type="numbering" w:default="1" w:styleId="Nessunelenco">
     <w:name w:val="No List"/>
     <w:uiPriority w:val="99"/>
     <w:semiHidden/>
     <w:unhideWhenUsed/>
   </w:style>
-  <w:style w:type="character" w:customStyle="1" w:styleId="Heading1Char">
-    <w:name w:val="Heading 1 Char"/>
-    <w:basedOn w:val="DefaultParagraphFont"/>
-    <w:link w:val="Heading1"/>
+  <w:style w:type="character" w:customStyle="1" w:styleId="Titolo1Carattere">
+    <w:name w:val="Titolo 1 Carattere"/>
+    <w:basedOn w:val="Carpredefinitoparagrafo"/>
+    <w:link w:val="Titolo1"/>
     <w:uiPriority w:val="9"/>
-    <w:rsid w:val="00697981"/>
+    <w:rsid w:val="00706E00"/>
     <w:rPr>
-      <w:rFonts w:asciiTheme="majorHAnsi" w:eastAsiaTheme="majorEastAsia" w:hAnsiTheme="majorHAnsi" w:cstheme="majorBidi"/>
-      <w:color w:val="0F4761" w:themeColor="accent1" w:themeShade="BF"/>
+      <w:rFonts w:ascii="Segoe UI" w:eastAsiaTheme="majorEastAsia" w:hAnsi="Segoe UI" w:cstheme="majorBidi"/>
+      <w:b/>
+      <w:color w:val="196B24" w:themeColor="accent3"/>
       <w:sz w:val="40"/>
       <w:szCs w:val="40"/>
     </w:rPr>
   </w:style>
-  <w:style w:type="character" w:customStyle="1" w:styleId="Heading2Char">
-    <w:name w:val="Heading 2 Char"/>
-    <w:basedOn w:val="DefaultParagraphFont"/>
-    <w:link w:val="Heading2"/>
+  <w:style w:type="character" w:customStyle="1" w:styleId="Titolo2Carattere">
+    <w:name w:val="Titolo 2 Carattere"/>
+    <w:basedOn w:val="Carpredefinitoparagrafo"/>
+    <w:link w:val="Titolo2"/>
     <w:uiPriority w:val="9"/>
-    <w:rsid w:val="00697981"/>
+    <w:rsid w:val="00706E00"/>
     <w:rPr>
       <w:rFonts w:asciiTheme="majorHAnsi" w:eastAsiaTheme="majorEastAsia" w:hAnsiTheme="majorHAnsi" w:cstheme="majorBidi"/>
-      <w:color w:val="0F4761" w:themeColor="accent1" w:themeShade="BF"/>
+      <w:color w:val="47D459" w:themeColor="accent3" w:themeTint="99"/>
       <w:sz w:val="32"/>
       <w:szCs w:val="32"/>
     </w:rPr>
   </w:style>
-  <w:style w:type="character" w:customStyle="1" w:styleId="Heading3Char">
-    <w:name w:val="Heading 3 Char"/>
-    <w:basedOn w:val="DefaultParagraphFont"/>
-    <w:link w:val="Heading3"/>
+  <w:style w:type="character" w:customStyle="1" w:styleId="Titolo3Carattere">
+    <w:name w:val="Titolo 3 Carattere"/>
+    <w:basedOn w:val="Carpredefinitoparagrafo"/>
+    <w:link w:val="Titolo3"/>
     <w:uiPriority w:val="9"/>
     <w:rsid w:val="00697981"/>
     <w:rPr>
@@ -2598,10 +3127,10 @@
       <w:szCs w:val="28"/>
     </w:rPr>
   </w:style>
-  <w:style w:type="character" w:customStyle="1" w:styleId="Heading4Char">
-    <w:name w:val="Heading 4 Char"/>
-    <w:basedOn w:val="DefaultParagraphFont"/>
-    <w:link w:val="Heading4"/>
+  <w:style w:type="character" w:customStyle="1" w:styleId="Titolo4Carattere">
+    <w:name w:val="Titolo 4 Carattere"/>
+    <w:basedOn w:val="Carpredefinitoparagrafo"/>
+    <w:link w:val="Titolo4"/>
     <w:uiPriority w:val="9"/>
     <w:rsid w:val="00697981"/>
     <w:rPr>
@@ -2611,24 +3140,24 @@
       <w:color w:val="0F4761" w:themeColor="accent1" w:themeShade="BF"/>
     </w:rPr>
   </w:style>
-  <w:style w:type="character" w:customStyle="1" w:styleId="Heading5Char">
-    <w:name w:val="Heading 5 Char"/>
-    <w:basedOn w:val="DefaultParagraphFont"/>
-    <w:link w:val="Heading5"/>
+  <w:style w:type="character" w:customStyle="1" w:styleId="Titolo5Carattere">
+    <w:name w:val="Titolo 5 Carattere"/>
+    <w:basedOn w:val="Carpredefinitoparagrafo"/>
+    <w:link w:val="Titolo5"/>
     <w:uiPriority w:val="9"/>
-    <w:semiHidden/>
-    <w:rsid w:val="00697981"/>
+    <w:rsid w:val="008E3F50"/>
     <w:rPr>
       <w:rFonts w:eastAsiaTheme="majorEastAsia" w:cstheme="majorBidi"/>
       <w:color w:val="0F4761" w:themeColor="accent1" w:themeShade="BF"/>
+      <w:sz w:val="22"/>
+      <w:u w:val="single"/>
     </w:rPr>
   </w:style>
-  <w:style w:type="character" w:customStyle="1" w:styleId="Heading6Char">
-    <w:name w:val="Heading 6 Char"/>
-    <w:basedOn w:val="DefaultParagraphFont"/>
-    <w:link w:val="Heading6"/>
+  <w:style w:type="character" w:customStyle="1" w:styleId="Titolo6Carattere">
+    <w:name w:val="Titolo 6 Carattere"/>
+    <w:basedOn w:val="Carpredefinitoparagrafo"/>
+    <w:link w:val="Titolo6"/>
     <w:uiPriority w:val="9"/>
-    <w:semiHidden/>
     <w:rsid w:val="00697981"/>
     <w:rPr>
       <w:rFonts w:eastAsiaTheme="majorEastAsia" w:cstheme="majorBidi"/>
@@ -2637,10 +3166,10 @@
       <w:color w:val="595959" w:themeColor="text1" w:themeTint="A6"/>
     </w:rPr>
   </w:style>
-  <w:style w:type="character" w:customStyle="1" w:styleId="Heading7Char">
-    <w:name w:val="Heading 7 Char"/>
-    <w:basedOn w:val="DefaultParagraphFont"/>
-    <w:link w:val="Heading7"/>
+  <w:style w:type="character" w:customStyle="1" w:styleId="Titolo7Carattere">
+    <w:name w:val="Titolo 7 Carattere"/>
+    <w:basedOn w:val="Carpredefinitoparagrafo"/>
+    <w:link w:val="Titolo7"/>
     <w:uiPriority w:val="9"/>
     <w:semiHidden/>
     <w:rsid w:val="00697981"/>
@@ -2649,10 +3178,10 @@
       <w:color w:val="595959" w:themeColor="text1" w:themeTint="A6"/>
     </w:rPr>
   </w:style>
-  <w:style w:type="character" w:customStyle="1" w:styleId="Heading8Char">
-    <w:name w:val="Heading 8 Char"/>
-    <w:basedOn w:val="DefaultParagraphFont"/>
-    <w:link w:val="Heading8"/>
+  <w:style w:type="character" w:customStyle="1" w:styleId="Titolo8Carattere">
+    <w:name w:val="Titolo 8 Carattere"/>
+    <w:basedOn w:val="Carpredefinitoparagrafo"/>
+    <w:link w:val="Titolo8"/>
     <w:uiPriority w:val="9"/>
     <w:semiHidden/>
     <w:rsid w:val="00697981"/>
@@ -2663,10 +3192,10 @@
       <w:color w:val="272727" w:themeColor="text1" w:themeTint="D8"/>
     </w:rPr>
   </w:style>
-  <w:style w:type="character" w:customStyle="1" w:styleId="Heading9Char">
-    <w:name w:val="Heading 9 Char"/>
-    <w:basedOn w:val="DefaultParagraphFont"/>
-    <w:link w:val="Heading9"/>
+  <w:style w:type="character" w:customStyle="1" w:styleId="Titolo9Carattere">
+    <w:name w:val="Titolo 9 Carattere"/>
+    <w:basedOn w:val="Carpredefinitoparagrafo"/>
+    <w:link w:val="Titolo9"/>
     <w:uiPriority w:val="9"/>
     <w:semiHidden/>
     <w:rsid w:val="00697981"/>
@@ -2675,11 +3204,11 @@
       <w:color w:val="272727" w:themeColor="text1" w:themeTint="D8"/>
     </w:rPr>
   </w:style>
-  <w:style w:type="paragraph" w:styleId="Title">
+  <w:style w:type="paragraph" w:styleId="Titolo">
     <w:name w:val="Title"/>
-    <w:basedOn w:val="Normal"/>
-    <w:next w:val="Normal"/>
-    <w:link w:val="TitleChar"/>
+    <w:basedOn w:val="Normale"/>
+    <w:next w:val="Normale"/>
+    <w:link w:val="TitoloCarattere"/>
     <w:uiPriority w:val="10"/>
     <w:qFormat/>
     <w:rsid w:val="00697981"/>
@@ -2695,10 +3224,10 @@
       <w:szCs w:val="56"/>
     </w:rPr>
   </w:style>
-  <w:style w:type="character" w:customStyle="1" w:styleId="TitleChar">
-    <w:name w:val="Title Char"/>
-    <w:basedOn w:val="DefaultParagraphFont"/>
-    <w:link w:val="Title"/>
+  <w:style w:type="character" w:customStyle="1" w:styleId="TitoloCarattere">
+    <w:name w:val="Titolo Carattere"/>
+    <w:basedOn w:val="Carpredefinitoparagrafo"/>
+    <w:link w:val="Titolo"/>
     <w:uiPriority w:val="10"/>
     <w:rsid w:val="00697981"/>
     <w:rPr>
@@ -2709,11 +3238,11 @@
       <w:szCs w:val="56"/>
     </w:rPr>
   </w:style>
-  <w:style w:type="paragraph" w:styleId="Subtitle">
+  <w:style w:type="paragraph" w:styleId="Sottotitolo">
     <w:name w:val="Subtitle"/>
-    <w:basedOn w:val="Normal"/>
-    <w:next w:val="Normal"/>
-    <w:link w:val="SubtitleChar"/>
+    <w:basedOn w:val="Normale"/>
+    <w:next w:val="Normale"/>
+    <w:link w:val="SottotitoloCarattere"/>
     <w:uiPriority w:val="11"/>
     <w:qFormat/>
     <w:rsid w:val="00697981"/>
@@ -2730,10 +3259,10 @@
       <w:szCs w:val="28"/>
     </w:rPr>
   </w:style>
-  <w:style w:type="character" w:customStyle="1" w:styleId="SubtitleChar">
-    <w:name w:val="Subtitle Char"/>
-    <w:basedOn w:val="DefaultParagraphFont"/>
-    <w:link w:val="Subtitle"/>
+  <w:style w:type="character" w:customStyle="1" w:styleId="SottotitoloCarattere">
+    <w:name w:val="Sottotitolo Carattere"/>
+    <w:basedOn w:val="Carpredefinitoparagrafo"/>
+    <w:link w:val="Sottotitolo"/>
     <w:uiPriority w:val="11"/>
     <w:rsid w:val="00697981"/>
     <w:rPr>
@@ -2744,11 +3273,11 @@
       <w:szCs w:val="28"/>
     </w:rPr>
   </w:style>
-  <w:style w:type="paragraph" w:styleId="Quote">
+  <w:style w:type="paragraph" w:styleId="Citazione">
     <w:name w:val="Quote"/>
-    <w:basedOn w:val="Normal"/>
-    <w:next w:val="Normal"/>
-    <w:link w:val="QuoteChar"/>
+    <w:basedOn w:val="Normale"/>
+    <w:next w:val="Normale"/>
+    <w:link w:val="CitazioneCarattere"/>
     <w:uiPriority w:val="29"/>
     <w:qFormat/>
     <w:rsid w:val="00697981"/>
@@ -2762,10 +3291,10 @@
       <w:color w:val="404040" w:themeColor="text1" w:themeTint="BF"/>
     </w:rPr>
   </w:style>
-  <w:style w:type="character" w:customStyle="1" w:styleId="QuoteChar">
-    <w:name w:val="Quote Char"/>
-    <w:basedOn w:val="DefaultParagraphFont"/>
-    <w:link w:val="Quote"/>
+  <w:style w:type="character" w:customStyle="1" w:styleId="CitazioneCarattere">
+    <w:name w:val="Citazione Carattere"/>
+    <w:basedOn w:val="Carpredefinitoparagrafo"/>
+    <w:link w:val="Citazione"/>
     <w:uiPriority w:val="29"/>
     <w:rsid w:val="00697981"/>
     <w:rPr>
@@ -2774,9 +3303,9 @@
       <w:color w:val="404040" w:themeColor="text1" w:themeTint="BF"/>
     </w:rPr>
   </w:style>
-  <w:style w:type="paragraph" w:styleId="ListParagraph">
+  <w:style w:type="paragraph" w:styleId="Paragrafoelenco">
     <w:name w:val="List Paragraph"/>
-    <w:basedOn w:val="Normal"/>
+    <w:basedOn w:val="Normale"/>
     <w:uiPriority w:val="34"/>
     <w:qFormat/>
     <w:rsid w:val="00697981"/>
@@ -2785,9 +3314,9 @@
       <w:contextualSpacing/>
     </w:pPr>
   </w:style>
-  <w:style w:type="character" w:styleId="IntenseEmphasis">
+  <w:style w:type="character" w:styleId="Enfasiintensa">
     <w:name w:val="Intense Emphasis"/>
-    <w:basedOn w:val="DefaultParagraphFont"/>
+    <w:basedOn w:val="Carpredefinitoparagrafo"/>
     <w:uiPriority w:val="21"/>
     <w:qFormat/>
     <w:rsid w:val="00697981"/>
@@ -2797,11 +3326,11 @@
       <w:color w:val="0F4761" w:themeColor="accent1" w:themeShade="BF"/>
     </w:rPr>
   </w:style>
-  <w:style w:type="paragraph" w:styleId="IntenseQuote">
+  <w:style w:type="paragraph" w:styleId="Citazioneintensa">
     <w:name w:val="Intense Quote"/>
-    <w:basedOn w:val="Normal"/>
-    <w:next w:val="Normal"/>
-    <w:link w:val="IntenseQuoteChar"/>
+    <w:basedOn w:val="Normale"/>
+    <w:next w:val="Normale"/>
+    <w:link w:val="CitazioneintensaCarattere"/>
     <w:uiPriority w:val="30"/>
     <w:qFormat/>
     <w:rsid w:val="00697981"/>
@@ -2820,10 +3349,10 @@
       <w:color w:val="0F4761" w:themeColor="accent1" w:themeShade="BF"/>
     </w:rPr>
   </w:style>
-  <w:style w:type="character" w:customStyle="1" w:styleId="IntenseQuoteChar">
-    <w:name w:val="Intense Quote Char"/>
-    <w:basedOn w:val="DefaultParagraphFont"/>
-    <w:link w:val="IntenseQuote"/>
+  <w:style w:type="character" w:customStyle="1" w:styleId="CitazioneintensaCarattere">
+    <w:name w:val="Citazione intensa Carattere"/>
+    <w:basedOn w:val="Carpredefinitoparagrafo"/>
+    <w:link w:val="Citazioneintensa"/>
     <w:uiPriority w:val="30"/>
     <w:rsid w:val="00697981"/>
     <w:rPr>
@@ -2832,9 +3361,9 @@
       <w:color w:val="0F4761" w:themeColor="accent1" w:themeShade="BF"/>
     </w:rPr>
   </w:style>
-  <w:style w:type="character" w:styleId="IntenseReference">
+  <w:style w:type="character" w:styleId="Riferimentointenso">
     <w:name w:val="Intense Reference"/>
-    <w:basedOn w:val="DefaultParagraphFont"/>
+    <w:basedOn w:val="Carpredefinitoparagrafo"/>
     <w:uiPriority w:val="32"/>
     <w:qFormat/>
     <w:rsid w:val="00697981"/>
@@ -2846,9 +3375,9 @@
       <w:spacing w:val="5"/>
     </w:rPr>
   </w:style>
-  <w:style w:type="table" w:styleId="TableGrid">
+  <w:style w:type="table" w:styleId="Grigliatabella">
     <w:name w:val="Table Grid"/>
-    <w:basedOn w:val="TableNormal"/>
+    <w:basedOn w:val="Tabellanormale"/>
     <w:uiPriority w:val="39"/>
     <w:rsid w:val="006917D2"/>
     <w:pPr>
@@ -2865,9 +3394,9 @@
       </w:tblBorders>
     </w:tblPr>
   </w:style>
-  <w:style w:type="table" w:styleId="GridTable4-Accent1">
+  <w:style w:type="table" w:styleId="Tabellagriglia4-colore1">
     <w:name w:val="Grid Table 4 Accent 1"/>
-    <w:basedOn w:val="TableNormal"/>
+    <w:basedOn w:val="Tabellanormale"/>
     <w:uiPriority w:val="49"/>
     <w:rsid w:val="006917D2"/>
     <w:pPr>

</xml_diff>

<commit_message>
risoluzione bug + pepper
risoluzioni malfunzionamenti profilo, aggiunta del pepper e modifica pw
</commit_message>
<xml_diff>
--- a/HackHub.docx
+++ b/HackHub.docx
@@ -4,7 +4,7 @@
   <w:body>
     <w:p>
       <w:pPr>
-        <w:pStyle w:val="Titolo1"/>
+        <w:pStyle w:val="Heading1"/>
       </w:pPr>
       <w:r>
         <w:t>HACKHUB</w:t>
@@ -12,7 +12,7 @@
     </w:p>
     <w:p>
       <w:pPr>
-        <w:pStyle w:val="Titolo2"/>
+        <w:pStyle w:val="Heading2"/>
         <w:spacing w:after="240"/>
       </w:pPr>
       <w:r>
@@ -21,7 +21,7 @@
     </w:p>
     <w:p>
       <w:pPr>
-        <w:pStyle w:val="Titolo3"/>
+        <w:pStyle w:val="Heading3"/>
       </w:pPr>
       <w:r>
         <w:t>Introduzione</w:t>
@@ -69,7 +69,7 @@
     </w:p>
     <w:p>
       <w:pPr>
-        <w:pStyle w:val="Titolo3"/>
+        <w:pStyle w:val="Heading3"/>
       </w:pPr>
       <w:r>
         <w:t>Ruoli nel progetto</w:t>
@@ -139,7 +139,7 @@
     </w:p>
     <w:p>
       <w:pPr>
-        <w:pStyle w:val="Paragrafoelenco"/>
+        <w:pStyle w:val="ListParagraph"/>
         <w:numPr>
           <w:ilvl w:val="0"/>
           <w:numId w:val="4"/>
@@ -169,7 +169,7 @@
     </w:p>
     <w:p>
       <w:pPr>
-        <w:pStyle w:val="Paragrafoelenco"/>
+        <w:pStyle w:val="ListParagraph"/>
         <w:numPr>
           <w:ilvl w:val="0"/>
           <w:numId w:val="4"/>
@@ -199,7 +199,7 @@
     </w:p>
     <w:p>
       <w:pPr>
-        <w:pStyle w:val="Titolo4"/>
+        <w:pStyle w:val="Heading4"/>
       </w:pPr>
       <w:r>
         <w:t>Visitatore</w:t>
@@ -220,7 +220,7 @@
     </w:p>
     <w:p>
       <w:pPr>
-        <w:pStyle w:val="Titolo4"/>
+        <w:pStyle w:val="Heading4"/>
       </w:pPr>
       <w:r>
         <w:t>Utente Registrato</w:t>
@@ -241,7 +241,7 @@
     </w:p>
     <w:p>
       <w:pPr>
-        <w:pStyle w:val="Titolo4"/>
+        <w:pStyle w:val="Heading4"/>
       </w:pPr>
       <w:r>
         <w:t>Team leader</w:t>
@@ -298,10 +298,9 @@
     </w:p>
     <w:p>
       <w:pPr>
-        <w:pStyle w:val="Titolo4"/>
-      </w:pPr>
-      <w:r>
-        <w:lastRenderedPageBreak/>
+        <w:pStyle w:val="Heading4"/>
+      </w:pPr>
+      <w:r>
         <w:t>Membro del team</w:t>
       </w:r>
     </w:p>
@@ -332,7 +331,7 @@
     </w:p>
     <w:p>
       <w:pPr>
-        <w:pStyle w:val="Titolo4"/>
+        <w:pStyle w:val="Heading4"/>
       </w:pPr>
       <w:r>
         <w:t>Staff</w:t>
@@ -368,7 +367,7 @@
     </w:p>
     <w:p>
       <w:pPr>
-        <w:pStyle w:val="Titolo4"/>
+        <w:pStyle w:val="Heading4"/>
       </w:pPr>
       <w:r>
         <w:t>Mentore</w:t>
@@ -398,7 +397,7 @@
     </w:p>
     <w:p>
       <w:pPr>
-        <w:pStyle w:val="Titolo4"/>
+        <w:pStyle w:val="Heading4"/>
       </w:pPr>
       <w:r>
         <w:t>Giudice</w:t>
@@ -461,7 +460,7 @@
     </w:p>
     <w:p>
       <w:pPr>
-        <w:pStyle w:val="Titolo4"/>
+        <w:pStyle w:val="Heading4"/>
       </w:pPr>
       <w:r>
         <w:t>Organizzatore</w:t>
@@ -499,7 +498,7 @@
     </w:p>
     <w:p>
       <w:pPr>
-        <w:pStyle w:val="Titolo3"/>
+        <w:pStyle w:val="Heading3"/>
       </w:pPr>
       <w:r>
         <w:t>Ciclo di Vita di un Hackathon</w:t>
@@ -518,7 +517,7 @@
     </w:p>
     <w:tbl>
       <w:tblPr>
-        <w:tblStyle w:val="Tabellagriglia4-colore3"/>
+        <w:tblStyle w:val="GridTable4-Accent3"/>
         <w:tblW w:w="0" w:type="auto"/>
         <w:tblLook w:val="04A0" w:firstRow="1" w:lastRow="0" w:firstColumn="1" w:lastColumn="0" w:noHBand="0" w:noVBand="1"/>
       </w:tblPr>
@@ -801,11 +800,10 @@
     </w:p>
     <w:p>
       <w:pPr>
-        <w:pStyle w:val="Titolo2"/>
+        <w:pStyle w:val="Heading2"/>
         <w:spacing w:before="0" w:after="0"/>
       </w:pPr>
       <w:r>
-        <w:lastRenderedPageBreak/>
         <w:t>Architettura</w:t>
       </w:r>
     </w:p>
@@ -819,7 +817,7 @@
     </w:p>
     <w:p>
       <w:pPr>
-        <w:pStyle w:val="Titolo4"/>
+        <w:pStyle w:val="Heading4"/>
         <w:numPr>
           <w:ilvl w:val="0"/>
           <w:numId w:val="5"/>
@@ -843,13 +841,14 @@
     </w:p>
     <w:p>
       <w:pPr>
-        <w:pStyle w:val="Titolo4"/>
+        <w:pStyle w:val="Heading4"/>
         <w:numPr>
           <w:ilvl w:val="0"/>
           <w:numId w:val="5"/>
         </w:numPr>
       </w:pPr>
       <w:r>
+        <w:lastRenderedPageBreak/>
         <w:t>Business Logic Layer — Backend</w:t>
       </w:r>
     </w:p>
@@ -863,7 +862,7 @@
     </w:p>
     <w:p>
       <w:pPr>
-        <w:pStyle w:val="Titolo4"/>
+        <w:pStyle w:val="Heading4"/>
         <w:numPr>
           <w:ilvl w:val="0"/>
           <w:numId w:val="5"/>
@@ -884,7 +883,7 @@
     <w:p/>
     <w:p>
       <w:pPr>
-        <w:pStyle w:val="Titolo2"/>
+        <w:pStyle w:val="Heading2"/>
         <w:spacing w:after="0" w:line="360" w:lineRule="auto"/>
       </w:pPr>
       <w:r>
@@ -893,7 +892,7 @@
     </w:p>
     <w:p>
       <w:pPr>
-        <w:pStyle w:val="Titolo4"/>
+        <w:pStyle w:val="Heading4"/>
       </w:pPr>
       <w:r>
         <w:t>Backend — Java &amp; Spring Boot</w:t>
@@ -1007,117 +1006,117 @@
     </w:p>
     <w:p>
       <w:pPr>
-        <w:pStyle w:val="Titolo4"/>
+        <w:pStyle w:val="Heading4"/>
         <w:spacing w:before="0"/>
       </w:pPr>
       <w:r>
+        <w:t>Frontend — Angular</w:t>
+      </w:r>
+    </w:p>
+    <w:p>
+      <w:pPr>
+        <w:spacing w:after="0"/>
+      </w:pPr>
+      <w:r>
+        <w:t xml:space="preserve">Il frontend è una </w:t>
+      </w:r>
+      <w:r>
+        <w:t>Single Page Application</w:t>
+      </w:r>
+      <w:r>
+        <w:t xml:space="preserve"> sviluppata con Angular 21</w:t>
+      </w:r>
+      <w:r>
+        <w:t>, con supporto alla pwa (Progressive Web App)</w:t>
+      </w:r>
+      <w:r>
+        <w:t>. Angular adotta un'architettura basata su componenti riutilizzabili, ognuno dei quali incapsula template HTML, logica TypeScript e stili SCSS.</w:t>
+      </w:r>
+      <w:r>
+        <w:t xml:space="preserve"> </w:t>
+      </w:r>
+      <w:r>
+        <w:t>Per rendere la SPA responsive è stato adottato come toolkit di strumenti, Bootstrap 5.</w:t>
+      </w:r>
+    </w:p>
+    <w:p>
+      <w:pPr>
+        <w:pStyle w:val="Heading4"/>
+      </w:pPr>
+      <w:r>
+        <w:t>Progressive Web App (PWA)</w:t>
+      </w:r>
+    </w:p>
+    <w:p>
+      <w:r>
+        <w:t>Per rendere l’applicazione fruibile facilmente anche da mobile,</w:t>
+      </w:r>
+      <w:r>
+        <w:t xml:space="preserve"> </w:t>
+      </w:r>
+      <w:r>
+        <w:t xml:space="preserve">è </w:t>
+      </w:r>
+      <w:r>
+        <w:t>previsto un</w:t>
+      </w:r>
+      <w:r>
+        <w:t xml:space="preserve"> supporto alla</w:t>
+      </w:r>
+      <w:r>
+        <w:t xml:space="preserve"> Progressive Web App tramite il pacchetto @angular/pwa.</w:t>
+      </w:r>
+    </w:p>
+    <w:p/>
+    <w:p>
+      <w:pPr>
+        <w:pStyle w:val="Heading2"/>
+        <w:spacing w:after="120"/>
+      </w:pPr>
+      <w:r>
+        <w:t>Sicurezza</w:t>
+      </w:r>
+    </w:p>
+    <w:p>
+      <w:r>
+        <w:t xml:space="preserve">La sicurezza dell'applicazione è gestita sia </w:t>
+      </w:r>
+      <w:r>
+        <w:t>lato</w:t>
+      </w:r>
+      <w:r>
+        <w:t xml:space="preserve"> </w:t>
+      </w:r>
+      <w:r>
+        <w:t>frontend che backend.</w:t>
+      </w:r>
+    </w:p>
+    <w:p>
+      <w:pPr>
+        <w:pStyle w:val="Heading4"/>
+      </w:pPr>
+      <w:r>
         <w:lastRenderedPageBreak/>
-        <w:t>Frontend — Angular</w:t>
-      </w:r>
-    </w:p>
-    <w:p>
-      <w:pPr>
-        <w:spacing w:after="0"/>
-      </w:pPr>
-      <w:r>
-        <w:t xml:space="preserve">Il frontend è una </w:t>
-      </w:r>
-      <w:r>
-        <w:t>Single Page Application</w:t>
-      </w:r>
-      <w:r>
-        <w:t xml:space="preserve"> sviluppata con Angular 21</w:t>
-      </w:r>
-      <w:r>
-        <w:t>, con supporto alla pwa (Progressive Web App)</w:t>
-      </w:r>
-      <w:r>
-        <w:t>. Angular adotta un'architettura basata su componenti riutilizzabili, ognuno dei quali incapsula template HTML, logica TypeScript e stili SCSS.</w:t>
+        <w:t>Autenticazione JWT</w:t>
+      </w:r>
+    </w:p>
+    <w:p>
+      <w:r>
+        <w:t>L'accesso alle funzionalità protette della piattaforma è regolato da un sistema di autenticazione basato su JWT (JSON Web Token).</w:t>
       </w:r>
       <w:r>
         <w:t xml:space="preserve"> </w:t>
       </w:r>
       <w:r>
-        <w:t>Per rendere la SPA responsive è stato adottato come toolkit di strumenti, Bootstrap 5.</w:t>
-      </w:r>
-    </w:p>
-    <w:p>
-      <w:pPr>
-        <w:pStyle w:val="Titolo4"/>
-      </w:pPr>
-      <w:r>
-        <w:t>Progressive Web App (PWA)</w:t>
-      </w:r>
-    </w:p>
-    <w:p>
-      <w:r>
-        <w:t>Per rendere l’applicazione fruibile facilmente anche da mobile,</w:t>
+        <w:t>In caso di accesso a funzionalità protette, sprovvisti di autenticazione, verrà restituita una risposta con codice HTTP 401 (Unauthorized).</w:t>
       </w:r>
       <w:r>
         <w:t xml:space="preserve"> </w:t>
       </w:r>
-      <w:r>
-        <w:t xml:space="preserve">è </w:t>
-      </w:r>
-      <w:r>
-        <w:t>previsto un</w:t>
-      </w:r>
-      <w:r>
-        <w:t xml:space="preserve"> supporto alla</w:t>
-      </w:r>
-      <w:r>
-        <w:t xml:space="preserve"> Progressive Web App tramite il pacchetto @angular/pwa.</w:t>
-      </w:r>
-    </w:p>
-    <w:p/>
-    <w:p>
-      <w:pPr>
-        <w:pStyle w:val="Titolo2"/>
-        <w:spacing w:after="120"/>
-      </w:pPr>
-      <w:r>
-        <w:t>Sicurezza</w:t>
-      </w:r>
-    </w:p>
-    <w:p>
-      <w:r>
-        <w:t xml:space="preserve">La sicurezza dell'applicazione è gestita sia </w:t>
-      </w:r>
-      <w:r>
-        <w:t>lato</w:t>
-      </w:r>
-      <w:r>
-        <w:t xml:space="preserve"> </w:t>
-      </w:r>
-      <w:r>
-        <w:t>frontend che backend.</w:t>
-      </w:r>
-    </w:p>
-    <w:p>
-      <w:pPr>
-        <w:pStyle w:val="Titolo4"/>
-      </w:pPr>
-      <w:r>
-        <w:t>Autenticazione JWT</w:t>
-      </w:r>
-    </w:p>
-    <w:p>
-      <w:r>
-        <w:t>L'accesso alle funzionalità protette della piattaforma è regolato da un sistema di autenticazione basato su JWT (JSON Web Token).</w:t>
-      </w:r>
-      <w:r>
-        <w:t xml:space="preserve"> </w:t>
-      </w:r>
-      <w:r>
-        <w:t>In caso di accesso a funzionalità protette, sprovvisti di autenticazione, verrà restituita una risposta con codice HTTP 401 (Unauthorized).</w:t>
-      </w:r>
-      <w:r>
-        <w:t xml:space="preserve"> </w:t>
-      </w:r>
-    </w:p>
-    <w:p>
-      <w:pPr>
-        <w:pStyle w:val="Titolo4"/>
+    </w:p>
+    <w:p>
+      <w:pPr>
+        <w:pStyle w:val="Heading4"/>
       </w:pPr>
       <w:r>
         <w:t>Autorizzazione Basata sui Ruoli</w:t>
@@ -1184,7 +1183,7 @@
     </w:p>
     <w:p>
       <w:pPr>
-        <w:pStyle w:val="Titolo4"/>
+        <w:pStyle w:val="Heading4"/>
       </w:pPr>
       <w:r>
         <w:t>Cors</w:t>
@@ -1203,7 +1202,7 @@
       <w:hyperlink r:id="rId8" w:history="1">
         <w:r>
           <w:rPr>
-            <w:rStyle w:val="Collegamentoipertestuale"/>
+            <w:rStyle w:val="Hyperlink"/>
           </w:rPr>
           <w:t>http://localhost:4200</w:t>
         </w:r>
@@ -1217,7 +1216,7 @@
     </w:p>
     <w:p>
       <w:pPr>
-        <w:pStyle w:val="Titolo4"/>
+        <w:pStyle w:val="Heading4"/>
       </w:pPr>
       <w:r>
         <w:t>Crittografia</w:t>
@@ -1245,12 +1244,18 @@
         <w:t xml:space="preserve"> </w:t>
       </w:r>
       <w:r>
-        <w:t>messa a disposizione da Spring Security che crittograferà tramite l’utilizzo di una secret (da noi impostata) e del salt gestito automaticamente dalla libreria stessa.</w:t>
-      </w:r>
-    </w:p>
-    <w:p>
-      <w:pPr>
-        <w:pStyle w:val="Titolo4"/>
+        <w:t>messa a disposizione da Spring Security che crittograferà tramite l’utilizzo di una secret (</w:t>
+      </w:r>
+      <w:r>
+        <w:t xml:space="preserve">pepper, </w:t>
+      </w:r>
+      <w:r>
+        <w:t>da noi impostata) e del salt gestito automaticamente dalla libreria stessa.</w:t>
+      </w:r>
+    </w:p>
+    <w:p>
+      <w:pPr>
+        <w:pStyle w:val="Heading4"/>
       </w:pPr>
       <w:r>
         <w:t>ORM (prevenzione SQL injection)</w:t>
@@ -1258,18 +1263,12 @@
     </w:p>
     <w:p>
       <w:r>
-        <w:t>Mediante l’utilizzo dell’ORM, si sono prevenuti eventuali errori di SQL injection</w:t>
-      </w:r>
-      <w:r>
-        <w:t>.</w:t>
-      </w:r>
-      <w:r>
-        <w:t xml:space="preserve"> </w:t>
-      </w:r>
-    </w:p>
-    <w:p>
-      <w:pPr>
-        <w:pStyle w:val="Titolo4"/>
+        <w:t>L'adozione dell'ORM Spring Data JPA (Hibernate) permette di gestire i dati tramite oggetti anziché query manuali. Questo garantisce l'uso intrinseco di query parametrizzate, che impediscono la concatenazione diretta degli input utente nel codice SQL, neutralizzando alla radice il rischio di attacchi SQL Injection.</w:t>
+      </w:r>
+    </w:p>
+    <w:p>
+      <w:pPr>
+        <w:pStyle w:val="Heading4"/>
       </w:pPr>
       <w:r>
         <w:t>Guard</w:t>
@@ -1339,7 +1338,7 @@
         <w:sdtContent>
           <w:p>
             <w:pPr>
-              <w:pStyle w:val="Pidipagina"/>
+              <w:pStyle w:val="Footer"/>
               <w:jc w:val="right"/>
             </w:pPr>
             <w:r>
@@ -1431,7 +1430,7 @@
   </w:sdt>
   <w:p>
     <w:pPr>
-      <w:pStyle w:val="Pidipagina"/>
+      <w:pStyle w:val="Footer"/>
     </w:pPr>
   </w:p>
 </w:ftr>
@@ -1466,7 +1465,7 @@
 <w:hdr xmlns:wpc="http://schemas.microsoft.com/office/word/2010/wordprocessingCanvas" xmlns:cx="http://schemas.microsoft.com/office/drawing/2014/chartex" xmlns:cx1="http://schemas.microsoft.com/office/drawing/2015/9/8/chartex" xmlns:cx2="http://schemas.microsoft.com/office/drawing/2015/10/21/chartex" xmlns:cx3="http://schemas.microsoft.com/office/drawing/2016/5/9/chartex" xmlns:cx4="http://schemas.microsoft.com/office/drawing/2016/5/10/chartex" xmlns:cx5="http://schemas.microsoft.com/office/drawing/2016/5/11/chartex" xmlns:cx6="http://schemas.microsoft.com/office/drawing/2016/5/12/chartex" xmlns:cx7="http://schemas.microsoft.com/office/drawing/2016/5/13/chartex" xmlns:cx8="http://schemas.microsoft.com/office/drawing/2016/5/14/chartex" xmlns:mc="http://schemas.openxmlformats.org/markup-compatibility/2006" xmlns:aink="http://schemas.microsoft.com/office/drawing/2016/ink" xmlns:am3d="http://schemas.microsoft.com/office/drawing/2017/model3d" xmlns:o="urn:schemas-microsoft-com:office:office" xmlns:oel="http://schemas.microsoft.com/office/2019/extlst" xmlns:r="http://schemas.openxmlformats.org/officeDocument/2006/relationships" xmlns:m="http://schemas.openxmlformats.org/officeDocument/2006/math" xmlns:v="urn:schemas-microsoft-com:vml" xmlns:wp14="http://schemas.microsoft.com/office/word/2010/wordprocessingDrawing" xmlns:wp="http://schemas.openxmlformats.org/drawingml/2006/wordprocessingDrawing" xmlns:w10="urn:schemas-microsoft-com:office:word" xmlns:w="http://schemas.openxmlformats.org/wordprocessingml/2006/main" xmlns:w14="http://schemas.microsoft.com/office/word/2010/wordml" xmlns:w15="http://schemas.microsoft.com/office/word/2012/wordml" xmlns:w16cex="http://schemas.microsoft.com/office/word/2018/wordml/cex" xmlns:w16cid="http://schemas.microsoft.com/office/word/2016/wordml/cid" xmlns:w16="http://schemas.microsoft.com/office/word/2018/wordml" xmlns:w16du="http://schemas.microsoft.com/office/word/2023/wordml/word16du" xmlns:w16sdtdh="http://schemas.microsoft.com/office/word/2020/wordml/sdtdatahash" xmlns:w16sdtfl="http://schemas.microsoft.com/office/word/2024/wordml/sdtformatlock" xmlns:w16se="http://schemas.microsoft.com/office/word/2015/wordml/symex" xmlns:wpg="http://schemas.microsoft.com/office/word/2010/wordprocessingGroup" xmlns:wpi="http://schemas.microsoft.com/office/word/2010/wordprocessingInk" xmlns:wne="http://schemas.microsoft.com/office/word/2006/wordml" xmlns:wps="http://schemas.microsoft.com/office/word/2010/wordprocessingShape" mc:Ignorable="w14 w15 w16se w16cid w16 w16cex w16sdtdh w16sdtfl w16du wp14">
   <w:p>
     <w:pPr>
-      <w:pStyle w:val="Intestazione"/>
+      <w:pStyle w:val="Header"/>
     </w:pPr>
     <w:r>
       <w:rPr>
@@ -2440,7 +2439,7 @@
     <w:lsdException w:name="Unresolved Mention" w:semiHidden="1" w:unhideWhenUsed="1"/>
     <w:lsdException w:name="Smart Link" w:semiHidden="1" w:unhideWhenUsed="1"/>
   </w:latentStyles>
-  <w:style w:type="paragraph" w:default="1" w:styleId="Normale">
+  <w:style w:type="paragraph" w:default="1" w:styleId="Normal">
     <w:name w:val="Normal"/>
     <w:qFormat/>
     <w:rsid w:val="00035674"/>
@@ -2452,11 +2451,11 @@
       <w:sz w:val="22"/>
     </w:rPr>
   </w:style>
-  <w:style w:type="paragraph" w:styleId="Titolo1">
+  <w:style w:type="paragraph" w:styleId="Heading1">
     <w:name w:val="heading 1"/>
-    <w:basedOn w:val="Normale"/>
-    <w:next w:val="Normale"/>
-    <w:link w:val="Titolo1Carattere"/>
+    <w:basedOn w:val="Normal"/>
+    <w:next w:val="Normal"/>
+    <w:link w:val="Heading1Char"/>
     <w:uiPriority w:val="9"/>
     <w:qFormat/>
     <w:rsid w:val="00CF5D50"/>
@@ -2479,11 +2478,11 @@
       <w:szCs w:val="40"/>
     </w:rPr>
   </w:style>
-  <w:style w:type="paragraph" w:styleId="Titolo2">
+  <w:style w:type="paragraph" w:styleId="Heading2">
     <w:name w:val="heading 2"/>
-    <w:basedOn w:val="Normale"/>
-    <w:next w:val="Normale"/>
-    <w:link w:val="Titolo2Carattere"/>
+    <w:basedOn w:val="Normal"/>
+    <w:next w:val="Normal"/>
+    <w:link w:val="Heading2Char"/>
     <w:uiPriority w:val="9"/>
     <w:unhideWhenUsed/>
     <w:qFormat/>
@@ -2502,11 +2501,11 @@
       <w:szCs w:val="32"/>
     </w:rPr>
   </w:style>
-  <w:style w:type="paragraph" w:styleId="Titolo3">
+  <w:style w:type="paragraph" w:styleId="Heading3">
     <w:name w:val="heading 3"/>
-    <w:basedOn w:val="Normale"/>
-    <w:next w:val="Normale"/>
-    <w:link w:val="Titolo3Carattere"/>
+    <w:basedOn w:val="Normal"/>
+    <w:next w:val="Normal"/>
+    <w:link w:val="Heading3Char"/>
     <w:uiPriority w:val="9"/>
     <w:unhideWhenUsed/>
     <w:qFormat/>
@@ -2525,11 +2524,11 @@
       <w:szCs w:val="28"/>
     </w:rPr>
   </w:style>
-  <w:style w:type="paragraph" w:styleId="Titolo4">
+  <w:style w:type="paragraph" w:styleId="Heading4">
     <w:name w:val="heading 4"/>
-    <w:basedOn w:val="Normale"/>
-    <w:next w:val="Normale"/>
-    <w:link w:val="Titolo4Carattere"/>
+    <w:basedOn w:val="Normal"/>
+    <w:next w:val="Normal"/>
+    <w:link w:val="Heading4Char"/>
     <w:uiPriority w:val="9"/>
     <w:unhideWhenUsed/>
     <w:qFormat/>
@@ -2548,11 +2547,11 @@
       <w:color w:val="595959" w:themeColor="text1" w:themeTint="A6"/>
     </w:rPr>
   </w:style>
-  <w:style w:type="paragraph" w:styleId="Titolo5">
+  <w:style w:type="paragraph" w:styleId="Heading5">
     <w:name w:val="heading 5"/>
-    <w:basedOn w:val="Normale"/>
-    <w:next w:val="Normale"/>
-    <w:link w:val="Titolo5Carattere"/>
+    <w:basedOn w:val="Normal"/>
+    <w:next w:val="Normal"/>
+    <w:link w:val="Heading5Char"/>
     <w:uiPriority w:val="9"/>
     <w:unhideWhenUsed/>
     <w:qFormat/>
@@ -2569,11 +2568,11 @@
       <w:u w:val="single"/>
     </w:rPr>
   </w:style>
-  <w:style w:type="paragraph" w:styleId="Titolo6">
+  <w:style w:type="paragraph" w:styleId="Heading6">
     <w:name w:val="heading 6"/>
-    <w:basedOn w:val="Normale"/>
-    <w:next w:val="Normale"/>
-    <w:link w:val="Titolo6Carattere"/>
+    <w:basedOn w:val="Normal"/>
+    <w:next w:val="Normal"/>
+    <w:link w:val="Heading6Char"/>
     <w:uiPriority w:val="9"/>
     <w:unhideWhenUsed/>
     <w:qFormat/>
@@ -2591,11 +2590,11 @@
       <w:color w:val="595959" w:themeColor="text1" w:themeTint="A6"/>
     </w:rPr>
   </w:style>
-  <w:style w:type="paragraph" w:styleId="Titolo7">
+  <w:style w:type="paragraph" w:styleId="Heading7">
     <w:name w:val="heading 7"/>
-    <w:basedOn w:val="Normale"/>
-    <w:next w:val="Normale"/>
-    <w:link w:val="Titolo7Carattere"/>
+    <w:basedOn w:val="Normal"/>
+    <w:next w:val="Normal"/>
+    <w:link w:val="Heading7Char"/>
     <w:uiPriority w:val="9"/>
     <w:semiHidden/>
     <w:unhideWhenUsed/>
@@ -2612,11 +2611,11 @@
       <w:color w:val="595959" w:themeColor="text1" w:themeTint="A6"/>
     </w:rPr>
   </w:style>
-  <w:style w:type="paragraph" w:styleId="Titolo8">
+  <w:style w:type="paragraph" w:styleId="Heading8">
     <w:name w:val="heading 8"/>
-    <w:basedOn w:val="Normale"/>
-    <w:next w:val="Normale"/>
-    <w:link w:val="Titolo8Carattere"/>
+    <w:basedOn w:val="Normal"/>
+    <w:next w:val="Normal"/>
+    <w:link w:val="Heading8Char"/>
     <w:uiPriority w:val="9"/>
     <w:semiHidden/>
     <w:unhideWhenUsed/>
@@ -2635,11 +2634,11 @@
       <w:color w:val="272727" w:themeColor="text1" w:themeTint="D8"/>
     </w:rPr>
   </w:style>
-  <w:style w:type="paragraph" w:styleId="Titolo9">
+  <w:style w:type="paragraph" w:styleId="Heading9">
     <w:name w:val="heading 9"/>
-    <w:basedOn w:val="Normale"/>
-    <w:next w:val="Normale"/>
-    <w:link w:val="Titolo9Carattere"/>
+    <w:basedOn w:val="Normal"/>
+    <w:next w:val="Normal"/>
+    <w:link w:val="Heading9Char"/>
     <w:uiPriority w:val="9"/>
     <w:semiHidden/>
     <w:unhideWhenUsed/>
@@ -2656,12 +2655,12 @@
       <w:color w:val="272727" w:themeColor="text1" w:themeTint="D8"/>
     </w:rPr>
   </w:style>
-  <w:style w:type="character" w:default="1" w:styleId="Carpredefinitoparagrafo">
+  <w:style w:type="character" w:default="1" w:styleId="DefaultParagraphFont">
     <w:name w:val="Default Paragraph Font"/>
     <w:uiPriority w:val="1"/>
     <w:unhideWhenUsed/>
   </w:style>
-  <w:style w:type="table" w:default="1" w:styleId="Tabellanormale">
+  <w:style w:type="table" w:default="1" w:styleId="TableNormal">
     <w:name w:val="Normal Table"/>
     <w:uiPriority w:val="99"/>
     <w:semiHidden/>
@@ -2676,16 +2675,16 @@
       </w:tblCellMar>
     </w:tblPr>
   </w:style>
-  <w:style w:type="numbering" w:default="1" w:styleId="Nessunelenco">
+  <w:style w:type="numbering" w:default="1" w:styleId="NoList">
     <w:name w:val="No List"/>
     <w:uiPriority w:val="99"/>
     <w:semiHidden/>
     <w:unhideWhenUsed/>
   </w:style>
-  <w:style w:type="character" w:customStyle="1" w:styleId="Titolo1Carattere">
-    <w:name w:val="Titolo 1 Carattere"/>
-    <w:basedOn w:val="Carpredefinitoparagrafo"/>
-    <w:link w:val="Titolo1"/>
+  <w:style w:type="character" w:customStyle="1" w:styleId="Heading1Char">
+    <w:name w:val="Heading 1 Char"/>
+    <w:basedOn w:val="DefaultParagraphFont"/>
+    <w:link w:val="Heading1"/>
     <w:uiPriority w:val="9"/>
     <w:rsid w:val="00CF5D50"/>
     <w:rPr>
@@ -2697,10 +2696,10 @@
       <w:shd w:val="clear" w:color="auto" w:fill="E9F8E4"/>
     </w:rPr>
   </w:style>
-  <w:style w:type="character" w:customStyle="1" w:styleId="Titolo2Carattere">
-    <w:name w:val="Titolo 2 Carattere"/>
-    <w:basedOn w:val="Carpredefinitoparagrafo"/>
-    <w:link w:val="Titolo2"/>
+  <w:style w:type="character" w:customStyle="1" w:styleId="Heading2Char">
+    <w:name w:val="Heading 2 Char"/>
+    <w:basedOn w:val="DefaultParagraphFont"/>
+    <w:link w:val="Heading2"/>
     <w:uiPriority w:val="9"/>
     <w:rsid w:val="00B36CAC"/>
     <w:rPr>
@@ -2711,10 +2710,10 @@
       <w:szCs w:val="32"/>
     </w:rPr>
   </w:style>
-  <w:style w:type="character" w:customStyle="1" w:styleId="Titolo3Carattere">
-    <w:name w:val="Titolo 3 Carattere"/>
-    <w:basedOn w:val="Carpredefinitoparagrafo"/>
-    <w:link w:val="Titolo3"/>
+  <w:style w:type="character" w:customStyle="1" w:styleId="Heading3Char">
+    <w:name w:val="Heading 3 Char"/>
+    <w:basedOn w:val="DefaultParagraphFont"/>
+    <w:link w:val="Heading3"/>
     <w:uiPriority w:val="9"/>
     <w:rsid w:val="004C60D2"/>
     <w:rPr>
@@ -2725,10 +2724,10 @@
       <w:szCs w:val="28"/>
     </w:rPr>
   </w:style>
-  <w:style w:type="character" w:customStyle="1" w:styleId="Titolo4Carattere">
-    <w:name w:val="Titolo 4 Carattere"/>
-    <w:basedOn w:val="Carpredefinitoparagrafo"/>
-    <w:link w:val="Titolo4"/>
+  <w:style w:type="character" w:customStyle="1" w:styleId="Heading4Char">
+    <w:name w:val="Heading 4 Char"/>
+    <w:basedOn w:val="DefaultParagraphFont"/>
+    <w:link w:val="Heading4"/>
     <w:uiPriority w:val="9"/>
     <w:rsid w:val="00B36CAC"/>
     <w:rPr>
@@ -2740,10 +2739,10 @@
       <w:sz w:val="22"/>
     </w:rPr>
   </w:style>
-  <w:style w:type="character" w:customStyle="1" w:styleId="Titolo5Carattere">
-    <w:name w:val="Titolo 5 Carattere"/>
-    <w:basedOn w:val="Carpredefinitoparagrafo"/>
-    <w:link w:val="Titolo5"/>
+  <w:style w:type="character" w:customStyle="1" w:styleId="Heading5Char">
+    <w:name w:val="Heading 5 Char"/>
+    <w:basedOn w:val="DefaultParagraphFont"/>
+    <w:link w:val="Heading5"/>
     <w:uiPriority w:val="9"/>
     <w:rsid w:val="008E3F50"/>
     <w:rPr>
@@ -2753,10 +2752,10 @@
       <w:u w:val="single"/>
     </w:rPr>
   </w:style>
-  <w:style w:type="character" w:customStyle="1" w:styleId="Titolo6Carattere">
-    <w:name w:val="Titolo 6 Carattere"/>
-    <w:basedOn w:val="Carpredefinitoparagrafo"/>
-    <w:link w:val="Titolo6"/>
+  <w:style w:type="character" w:customStyle="1" w:styleId="Heading6Char">
+    <w:name w:val="Heading 6 Char"/>
+    <w:basedOn w:val="DefaultParagraphFont"/>
+    <w:link w:val="Heading6"/>
     <w:uiPriority w:val="9"/>
     <w:rsid w:val="00697981"/>
     <w:rPr>
@@ -2766,10 +2765,10 @@
       <w:color w:val="595959" w:themeColor="text1" w:themeTint="A6"/>
     </w:rPr>
   </w:style>
-  <w:style w:type="character" w:customStyle="1" w:styleId="Titolo7Carattere">
-    <w:name w:val="Titolo 7 Carattere"/>
-    <w:basedOn w:val="Carpredefinitoparagrafo"/>
-    <w:link w:val="Titolo7"/>
+  <w:style w:type="character" w:customStyle="1" w:styleId="Heading7Char">
+    <w:name w:val="Heading 7 Char"/>
+    <w:basedOn w:val="DefaultParagraphFont"/>
+    <w:link w:val="Heading7"/>
     <w:uiPriority w:val="9"/>
     <w:semiHidden/>
     <w:rsid w:val="00697981"/>
@@ -2778,10 +2777,10 @@
       <w:color w:val="595959" w:themeColor="text1" w:themeTint="A6"/>
     </w:rPr>
   </w:style>
-  <w:style w:type="character" w:customStyle="1" w:styleId="Titolo8Carattere">
-    <w:name w:val="Titolo 8 Carattere"/>
-    <w:basedOn w:val="Carpredefinitoparagrafo"/>
-    <w:link w:val="Titolo8"/>
+  <w:style w:type="character" w:customStyle="1" w:styleId="Heading8Char">
+    <w:name w:val="Heading 8 Char"/>
+    <w:basedOn w:val="DefaultParagraphFont"/>
+    <w:link w:val="Heading8"/>
     <w:uiPriority w:val="9"/>
     <w:semiHidden/>
     <w:rsid w:val="00697981"/>
@@ -2792,10 +2791,10 @@
       <w:color w:val="272727" w:themeColor="text1" w:themeTint="D8"/>
     </w:rPr>
   </w:style>
-  <w:style w:type="character" w:customStyle="1" w:styleId="Titolo9Carattere">
-    <w:name w:val="Titolo 9 Carattere"/>
-    <w:basedOn w:val="Carpredefinitoparagrafo"/>
-    <w:link w:val="Titolo9"/>
+  <w:style w:type="character" w:customStyle="1" w:styleId="Heading9Char">
+    <w:name w:val="Heading 9 Char"/>
+    <w:basedOn w:val="DefaultParagraphFont"/>
+    <w:link w:val="Heading9"/>
     <w:uiPriority w:val="9"/>
     <w:semiHidden/>
     <w:rsid w:val="00697981"/>
@@ -2804,11 +2803,11 @@
       <w:color w:val="272727" w:themeColor="text1" w:themeTint="D8"/>
     </w:rPr>
   </w:style>
-  <w:style w:type="paragraph" w:styleId="Titolo">
+  <w:style w:type="paragraph" w:styleId="Title">
     <w:name w:val="Title"/>
-    <w:basedOn w:val="Normale"/>
-    <w:next w:val="Normale"/>
-    <w:link w:val="TitoloCarattere"/>
+    <w:basedOn w:val="Normal"/>
+    <w:next w:val="Normal"/>
+    <w:link w:val="TitleChar"/>
     <w:uiPriority w:val="10"/>
     <w:qFormat/>
     <w:rsid w:val="00697981"/>
@@ -2824,10 +2823,10 @@
       <w:szCs w:val="56"/>
     </w:rPr>
   </w:style>
-  <w:style w:type="character" w:customStyle="1" w:styleId="TitoloCarattere">
-    <w:name w:val="Titolo Carattere"/>
-    <w:basedOn w:val="Carpredefinitoparagrafo"/>
-    <w:link w:val="Titolo"/>
+  <w:style w:type="character" w:customStyle="1" w:styleId="TitleChar">
+    <w:name w:val="Title Char"/>
+    <w:basedOn w:val="DefaultParagraphFont"/>
+    <w:link w:val="Title"/>
     <w:uiPriority w:val="10"/>
     <w:rsid w:val="00697981"/>
     <w:rPr>
@@ -2838,11 +2837,11 @@
       <w:szCs w:val="56"/>
     </w:rPr>
   </w:style>
-  <w:style w:type="paragraph" w:styleId="Sottotitolo">
+  <w:style w:type="paragraph" w:styleId="Subtitle">
     <w:name w:val="Subtitle"/>
-    <w:basedOn w:val="Normale"/>
-    <w:next w:val="Normale"/>
-    <w:link w:val="SottotitoloCarattere"/>
+    <w:basedOn w:val="Normal"/>
+    <w:next w:val="Normal"/>
+    <w:link w:val="SubtitleChar"/>
     <w:uiPriority w:val="11"/>
     <w:qFormat/>
     <w:rsid w:val="00697981"/>
@@ -2859,10 +2858,10 @@
       <w:szCs w:val="28"/>
     </w:rPr>
   </w:style>
-  <w:style w:type="character" w:customStyle="1" w:styleId="SottotitoloCarattere">
-    <w:name w:val="Sottotitolo Carattere"/>
-    <w:basedOn w:val="Carpredefinitoparagrafo"/>
-    <w:link w:val="Sottotitolo"/>
+  <w:style w:type="character" w:customStyle="1" w:styleId="SubtitleChar">
+    <w:name w:val="Subtitle Char"/>
+    <w:basedOn w:val="DefaultParagraphFont"/>
+    <w:link w:val="Subtitle"/>
     <w:uiPriority w:val="11"/>
     <w:rsid w:val="00697981"/>
     <w:rPr>
@@ -2873,11 +2872,11 @@
       <w:szCs w:val="28"/>
     </w:rPr>
   </w:style>
-  <w:style w:type="paragraph" w:styleId="Citazione">
+  <w:style w:type="paragraph" w:styleId="Quote">
     <w:name w:val="Quote"/>
-    <w:basedOn w:val="Normale"/>
-    <w:next w:val="Normale"/>
-    <w:link w:val="CitazioneCarattere"/>
+    <w:basedOn w:val="Normal"/>
+    <w:next w:val="Normal"/>
+    <w:link w:val="QuoteChar"/>
     <w:uiPriority w:val="29"/>
     <w:qFormat/>
     <w:rsid w:val="00697981"/>
@@ -2891,10 +2890,10 @@
       <w:color w:val="404040" w:themeColor="text1" w:themeTint="BF"/>
     </w:rPr>
   </w:style>
-  <w:style w:type="character" w:customStyle="1" w:styleId="CitazioneCarattere">
-    <w:name w:val="Citazione Carattere"/>
-    <w:basedOn w:val="Carpredefinitoparagrafo"/>
-    <w:link w:val="Citazione"/>
+  <w:style w:type="character" w:customStyle="1" w:styleId="QuoteChar">
+    <w:name w:val="Quote Char"/>
+    <w:basedOn w:val="DefaultParagraphFont"/>
+    <w:link w:val="Quote"/>
     <w:uiPriority w:val="29"/>
     <w:rsid w:val="00697981"/>
     <w:rPr>
@@ -2903,9 +2902,9 @@
       <w:color w:val="404040" w:themeColor="text1" w:themeTint="BF"/>
     </w:rPr>
   </w:style>
-  <w:style w:type="paragraph" w:styleId="Paragrafoelenco">
+  <w:style w:type="paragraph" w:styleId="ListParagraph">
     <w:name w:val="List Paragraph"/>
-    <w:basedOn w:val="Normale"/>
+    <w:basedOn w:val="Normal"/>
     <w:uiPriority w:val="34"/>
     <w:qFormat/>
     <w:rsid w:val="00697981"/>
@@ -2914,9 +2913,9 @@
       <w:contextualSpacing/>
     </w:pPr>
   </w:style>
-  <w:style w:type="character" w:styleId="Enfasiintensa">
+  <w:style w:type="character" w:styleId="IntenseEmphasis">
     <w:name w:val="Intense Emphasis"/>
-    <w:basedOn w:val="Carpredefinitoparagrafo"/>
+    <w:basedOn w:val="DefaultParagraphFont"/>
     <w:uiPriority w:val="21"/>
     <w:qFormat/>
     <w:rsid w:val="00697981"/>
@@ -2926,11 +2925,11 @@
       <w:color w:val="0F4761" w:themeColor="accent1" w:themeShade="BF"/>
     </w:rPr>
   </w:style>
-  <w:style w:type="paragraph" w:styleId="Citazioneintensa">
+  <w:style w:type="paragraph" w:styleId="IntenseQuote">
     <w:name w:val="Intense Quote"/>
-    <w:basedOn w:val="Normale"/>
-    <w:next w:val="Normale"/>
-    <w:link w:val="CitazioneintensaCarattere"/>
+    <w:basedOn w:val="Normal"/>
+    <w:next w:val="Normal"/>
+    <w:link w:val="IntenseQuoteChar"/>
     <w:uiPriority w:val="30"/>
     <w:qFormat/>
     <w:rsid w:val="00697981"/>
@@ -2949,10 +2948,10 @@
       <w:color w:val="0F4761" w:themeColor="accent1" w:themeShade="BF"/>
     </w:rPr>
   </w:style>
-  <w:style w:type="character" w:customStyle="1" w:styleId="CitazioneintensaCarattere">
-    <w:name w:val="Citazione intensa Carattere"/>
-    <w:basedOn w:val="Carpredefinitoparagrafo"/>
-    <w:link w:val="Citazioneintensa"/>
+  <w:style w:type="character" w:customStyle="1" w:styleId="IntenseQuoteChar">
+    <w:name w:val="Intense Quote Char"/>
+    <w:basedOn w:val="DefaultParagraphFont"/>
+    <w:link w:val="IntenseQuote"/>
     <w:uiPriority w:val="30"/>
     <w:rsid w:val="00697981"/>
     <w:rPr>
@@ -2961,9 +2960,9 @@
       <w:color w:val="0F4761" w:themeColor="accent1" w:themeShade="BF"/>
     </w:rPr>
   </w:style>
-  <w:style w:type="character" w:styleId="Riferimentointenso">
+  <w:style w:type="character" w:styleId="IntenseReference">
     <w:name w:val="Intense Reference"/>
-    <w:basedOn w:val="Carpredefinitoparagrafo"/>
+    <w:basedOn w:val="DefaultParagraphFont"/>
     <w:uiPriority w:val="32"/>
     <w:qFormat/>
     <w:rsid w:val="00697981"/>
@@ -2975,9 +2974,9 @@
       <w:spacing w:val="5"/>
     </w:rPr>
   </w:style>
-  <w:style w:type="table" w:styleId="Grigliatabella">
+  <w:style w:type="table" w:styleId="TableGrid">
     <w:name w:val="Table Grid"/>
-    <w:basedOn w:val="Tabellanormale"/>
+    <w:basedOn w:val="TableNormal"/>
     <w:uiPriority w:val="39"/>
     <w:rsid w:val="006917D2"/>
     <w:pPr>
@@ -2994,9 +2993,9 @@
       </w:tblBorders>
     </w:tblPr>
   </w:style>
-  <w:style w:type="table" w:styleId="Tabellagriglia4-colore1">
+  <w:style w:type="table" w:styleId="GridTable4-Accent1">
     <w:name w:val="Grid Table 4 Accent 1"/>
-    <w:basedOn w:val="Tabellanormale"/>
+    <w:basedOn w:val="TableNormal"/>
     <w:uiPriority w:val="49"/>
     <w:rsid w:val="006917D2"/>
     <w:pPr>
@@ -3070,9 +3069,9 @@
       </w:tcPr>
     </w:tblStylePr>
   </w:style>
-  <w:style w:type="table" w:styleId="Tabellagriglia4-colore3">
+  <w:style w:type="table" w:styleId="GridTable4-Accent3">
     <w:name w:val="Grid Table 4 Accent 3"/>
-    <w:basedOn w:val="Tabellanormale"/>
+    <w:basedOn w:val="TableNormal"/>
     <w:uiPriority w:val="49"/>
     <w:rsid w:val="00B36CAC"/>
     <w:pPr>
@@ -3146,10 +3145,10 @@
       </w:tcPr>
     </w:tblStylePr>
   </w:style>
-  <w:style w:type="paragraph" w:styleId="Intestazione">
+  <w:style w:type="paragraph" w:styleId="Header">
     <w:name w:val="header"/>
-    <w:basedOn w:val="Normale"/>
-    <w:link w:val="IntestazioneCarattere"/>
+    <w:basedOn w:val="Normal"/>
+    <w:link w:val="HeaderChar"/>
     <w:uiPriority w:val="99"/>
     <w:unhideWhenUsed/>
     <w:rsid w:val="004C60D2"/>
@@ -3161,10 +3160,10 @@
       <w:spacing w:after="0" w:line="240" w:lineRule="auto"/>
     </w:pPr>
   </w:style>
-  <w:style w:type="character" w:customStyle="1" w:styleId="IntestazioneCarattere">
-    <w:name w:val="Intestazione Carattere"/>
-    <w:basedOn w:val="Carpredefinitoparagrafo"/>
-    <w:link w:val="Intestazione"/>
+  <w:style w:type="character" w:customStyle="1" w:styleId="HeaderChar">
+    <w:name w:val="Header Char"/>
+    <w:basedOn w:val="DefaultParagraphFont"/>
+    <w:link w:val="Header"/>
     <w:uiPriority w:val="99"/>
     <w:rsid w:val="004C60D2"/>
     <w:rPr>
@@ -3172,10 +3171,10 @@
       <w:sz w:val="22"/>
     </w:rPr>
   </w:style>
-  <w:style w:type="paragraph" w:styleId="Pidipagina">
+  <w:style w:type="paragraph" w:styleId="Footer">
     <w:name w:val="footer"/>
-    <w:basedOn w:val="Normale"/>
-    <w:link w:val="PidipaginaCarattere"/>
+    <w:basedOn w:val="Normal"/>
+    <w:link w:val="FooterChar"/>
     <w:uiPriority w:val="99"/>
     <w:unhideWhenUsed/>
     <w:rsid w:val="004C60D2"/>
@@ -3187,10 +3186,10 @@
       <w:spacing w:after="0" w:line="240" w:lineRule="auto"/>
     </w:pPr>
   </w:style>
-  <w:style w:type="character" w:customStyle="1" w:styleId="PidipaginaCarattere">
-    <w:name w:val="Piè di pagina Carattere"/>
-    <w:basedOn w:val="Carpredefinitoparagrafo"/>
-    <w:link w:val="Pidipagina"/>
+  <w:style w:type="character" w:customStyle="1" w:styleId="FooterChar">
+    <w:name w:val="Footer Char"/>
+    <w:basedOn w:val="DefaultParagraphFont"/>
+    <w:link w:val="Footer"/>
     <w:uiPriority w:val="99"/>
     <w:rsid w:val="004C60D2"/>
     <w:rPr>
@@ -3198,9 +3197,9 @@
       <w:sz w:val="22"/>
     </w:rPr>
   </w:style>
-  <w:style w:type="character" w:styleId="Collegamentoipertestuale">
+  <w:style w:type="character" w:styleId="Hyperlink">
     <w:name w:val="Hyperlink"/>
-    <w:basedOn w:val="Carpredefinitoparagrafo"/>
+    <w:basedOn w:val="DefaultParagraphFont"/>
     <w:uiPriority w:val="99"/>
     <w:unhideWhenUsed/>
     <w:rsid w:val="00733B1A"/>
@@ -3209,9 +3208,9 @@
       <w:u w:val="single"/>
     </w:rPr>
   </w:style>
-  <w:style w:type="character" w:styleId="Menzionenonrisolta">
+  <w:style w:type="character" w:styleId="UnresolvedMention">
     <w:name w:val="Unresolved Mention"/>
-    <w:basedOn w:val="Carpredefinitoparagrafo"/>
+    <w:basedOn w:val="DefaultParagraphFont"/>
     <w:uiPriority w:val="99"/>
     <w:semiHidden/>
     <w:unhideWhenUsed/>

</xml_diff>